<commit_message>
snapshot: update methodology doc + add new dashboard mockups and exports
Co-Authored-By: Claude Opus 4.8 (1M context) <noreply@anthropic.com>
</commit_message>
<xml_diff>
--- a/מתודולוגיה_שקל_לנקודת_אמת_מידה.docx
+++ b/מתודולוגיה_שקל_לנקודת_אמת_מידה.docx
@@ -4212,16 +4212,7 @@
           <w:szCs w:val="22"/>
           <w:rtl/>
         </w:rPr>
-        <w:t xml:space="preserve">אימות: </w:t>
-      </w:r>
-      <w:r>
-        <w:rPr>
-          <w:rFonts w:ascii="David" w:cs="David" w:eastAsia="David" w:hAnsi="David"/>
-          <w:sz w:val="22"/>
-          <w:szCs w:val="22"/>
-          <w:rtl/>
-        </w:rPr>
-        <w:t xml:space="preserve">סכום ה-allocation על כל אמות המידה צריך לשחזר את approved_amount, עד תיקוני תקרה.</w:t>
+        <w:t>אימות: סכום ה-allocation על כל אמות המידה צריך לשחזר את approved_amount, עד תיקוני תקרה.</w:t>
       </w:r>
     </w:p>
     <w:p>
@@ -7086,7 +7077,7 @@
           <w:szCs w:val="22"/>
           <w:rtl/>
         </w:rPr>
-        <w:t xml:space="preserve">ענפי על בדיוק 1% (372,217 ₪), קבוצתי בדיוק 2% (69,188 ₪). חי בשורות 'אליפות אירופה' נפרדות, לא בשורת ה'איגוד'.</w:t>
+        <w:t xml:space="preserve">ענפי על בדיוק 1% (372,217 ₪) · קבוצתי בדיוק 2% (69,188 ₪). חי בשורות 'אליפות אירופה' נפרדות, לא בשורת ה'איגוד'.</w:t>
       </w:r>
     </w:p>
     <w:p>
@@ -7178,6 +7169,2807 @@
           <w:rtl/>
         </w:rPr>
         <w:t xml:space="preserve">המודל פר-אמת-מידה מסביר את כל התקציב פרט לשתי שכבות ידועות ומופות (אירופה + תקרה). אין רכיב לא-מוסבר.</w:t>
+      </w:r>
+    </w:p>
+    <w:p>
+      <w:pPr>
+        <w:pStyle w:val="Heading1"/>
+        <w:bidi/>
+        <w:spacing w:after="130" w:before="300"/>
+        <w:jc w:val="start"/>
+      </w:pPr>
+      <w:r>
+        <w:rPr>
+          <w:rFonts w:ascii="David" w:cs="David" w:eastAsia="David" w:hAnsi="David"/>
+          <w:b/>
+          <w:bCs/>
+          <w:color w:val="1F3F6D"/>
+          <w:sz w:val="32"/>
+          <w:szCs w:val="32"/>
+          <w:rtl/>
+        </w:rPr>
+        <w:t xml:space="preserve">אימות מספרי — היכן בדיוק יושבת השארית</w:t>
+      </w:r>
+    </w:p>
+    <w:p>
+      <w:pPr>
+        <w:bidi/>
+        <w:spacing w:after="120" w:before="60"/>
+        <w:jc w:val="start"/>
+      </w:pPr>
+      <w:r>
+        <w:rPr>
+          <w:rFonts w:ascii="David" w:cs="David" w:eastAsia="David" w:hAnsi="David"/>
+          <w:b/>
+          <w:bCs/>
+          <w:sz w:val="22"/>
+          <w:szCs w:val="22"/>
+          <w:rtl/>
+        </w:rPr>
+        <w:t xml:space="preserve">יש להבחין בין שתי שאלות נפרדות. </w:t>
+      </w:r>
+      <w:r>
+        <w:rPr>
+          <w:rFonts w:ascii="David" w:cs="David" w:eastAsia="David" w:hAnsi="David"/>
+          <w:sz w:val="22"/>
+          <w:szCs w:val="22"/>
+          <w:rtl/>
+        </w:rPr>
+        <w:t>ברמת אמת-מידה בודדת (שוטף) אין שארית כלל; השארית של ‏0.2%‏ שייכת אך ורק למודל הרב-קריטריוני ברמת האיגוד.</w:t>
+      </w:r>
+    </w:p>
+    <w:p>
+      <w:pPr>
+        <w:pStyle w:val="Heading1"/>
+        <w:bidi/>
+        <w:spacing w:after="130" w:before="300"/>
+        <w:jc w:val="start"/>
+      </w:pPr>
+      <w:r>
+        <w:rPr>
+          <w:rFonts w:ascii="David" w:cs="David" w:eastAsia="David" w:hAnsi="David"/>
+          <w:b/>
+          <w:bCs/>
+          <w:color w:val="248A3D"/>
+          <w:sz w:val="25"/>
+          <w:szCs w:val="25"/>
+          <w:rtl/>
+        </w:rPr>
+        <w:t xml:space="preserve">1. רמת אמת-מידה בודדת — מדויק לאגורה, אפס שארית</w:t>
+      </w:r>
+    </w:p>
+    <w:p>
+      <w:pPr>
+        <w:bidi/>
+        <w:spacing w:after="120" w:before="60"/>
+        <w:jc w:val="start"/>
+      </w:pPr>
+      <w:r>
+        <w:rPr>
+          <w:rFonts w:ascii="David" w:cs="David" w:eastAsia="David" w:hAnsi="David"/>
+          <w:sz w:val="22"/>
+          <w:szCs w:val="22"/>
+          <w:rtl/>
+        </w:rPr>
+        <w:t>נבדקו ‏5,418‏ קבוצות ב-‏57‏ ענפים. ב-‏56‏ ענפים כל הקבוצות הלא-חתוכות יושבות על R בדיוק (פיזור קטן מ-‏0.01‏ ₪ לנקודה), ו-‏0‏ קבוצות מעל R. ערכי R שחושבו זהים לטבלת הענפים שלמעלה עד האגורה. כלומר budget = points × R הוא זהות מתמטית מדויקת — הסטייה היחידה מהפרופורציה היא התקרה.</w:t>
+      </w:r>
+    </w:p>
+    <w:p>
+      <w:pPr>
+        <w:pStyle w:val="Heading1"/>
+        <w:bidi/>
+        <w:spacing w:after="130" w:before="300"/>
+        <w:jc w:val="start"/>
+      </w:pPr>
+      <w:r>
+        <w:rPr>
+          <w:rFonts w:ascii="David" w:cs="David" w:eastAsia="David" w:hAnsi="David"/>
+          <w:b/>
+          <w:bCs/>
+          <w:color w:val="248A3D"/>
+          <w:sz w:val="25"/>
+          <w:szCs w:val="25"/>
+          <w:rtl/>
+        </w:rPr>
+        <w:t xml:space="preserve">2. התקרה — סכום-אפס, ‏2.2% מהקופה</w:t>
+      </w:r>
+    </w:p>
+    <w:p>
+      <w:pPr>
+        <w:bidi/>
+        <w:spacing w:after="120" w:before="60"/>
+        <w:jc w:val="start"/>
+      </w:pPr>
+      <w:r>
+        <w:rPr>
+          <w:rFonts w:ascii="David" w:cs="David" w:eastAsia="David" w:hAnsi="David"/>
+          <w:sz w:val="22"/>
+          <w:szCs w:val="22"/>
+          <w:rtl/>
+        </w:rPr>
+        <w:t xml:space="preserve">סך הכסף שהתקרה הזיזה בכל הענפים = </w:t>
+      </w:r>
+      <w:r>
+        <w:rPr>
+          <w:rFonts w:ascii="David" w:cs="David" w:eastAsia="David" w:hAnsi="David"/>
+          <w:b/>
+          <w:bCs/>
+          <w:sz w:val="22"/>
+          <w:szCs w:val="22"/>
+          <w:rtl/>
+        </w:rPr>
+        <w:t xml:space="preserve">‏2,380,619‏ ₪ </w:t>
+      </w:r>
+      <w:r>
+        <w:rPr>
+          <w:rFonts w:ascii="David" w:cs="David" w:eastAsia="David" w:hAnsi="David"/>
+          <w:sz w:val="22"/>
+          <w:szCs w:val="22"/>
+          <w:rtl/>
+        </w:rPr>
+        <w:t>(‏2.2%‏ מהקופה), כולו מחולק-מחדש בתוך הענף לקבוצות הלא-חתוכות. רק ‏1.5%‏ מהקבוצות (‏82‏) נגעו בתקרה. דוגמת אתלטיקה אומתה לאגורה: קופה ‏924,734‏, קצב בסיס ‏69.83‏, קצב אפקטיבי ‏82.76‏; מכבי ת״א ירדה מ-‏300,600‏ ל-‏184,947‏ — הפרש ‏115,650‏ שעבר במלואו לשאר הקבוצות.</w:t>
+      </w:r>
+    </w:p>
+    <w:p>
+      <w:pPr>
+        <w:pStyle w:val="Heading1"/>
+        <w:bidi/>
+        <w:spacing w:after="130" w:before="300"/>
+        <w:jc w:val="start"/>
+      </w:pPr>
+      <w:r>
+        <w:rPr>
+          <w:rFonts w:ascii="David" w:cs="David" w:eastAsia="David" w:hAnsi="David"/>
+          <w:b/>
+          <w:bCs/>
+          <w:color w:val="DA3439"/>
+          <w:sz w:val="25"/>
+          <w:szCs w:val="25"/>
+          <w:rtl/>
+        </w:rPr>
+        <w:t xml:space="preserve">3. אזהרת דיוק — שדה cap_delta מנפח את השארית פי ‏12.6</w:t>
+      </w:r>
+    </w:p>
+    <w:p>
+      <w:pPr>
+        <w:bidi/>
+        <w:spacing w:after="120" w:before="60"/>
+        <w:jc w:val="start"/>
+      </w:pPr>
+      <w:r>
+        <w:rPr>
+          <w:rFonts w:ascii="David" w:cs="David" w:eastAsia="David" w:hAnsi="David"/>
+          <w:sz w:val="22"/>
+          <w:szCs w:val="22"/>
+          <w:rtl/>
+        </w:rPr>
+        <w:t xml:space="preserve">הנוסחה הנוכחית </w:t>
+      </w:r>
+      <w:r>
+        <w:rPr>
+          <w:rFonts w:ascii="David" w:cs="David" w:eastAsia="David" w:hAnsi="David"/>
+          <w:b/>
+          <w:bCs/>
+          <w:sz w:val="22"/>
+          <w:szCs w:val="22"/>
+          <w:rtl/>
+        </w:rPr>
+        <w:t xml:space="preserve">cap_delta = {approved_amount} − {total_score}×{value_per_point}</w:t>
+      </w:r>
+      <w:r>
+        <w:rPr>
+          <w:rFonts w:ascii="David" w:cs="David" w:eastAsia="David" w:hAnsi="David"/>
+          <w:sz w:val="22"/>
+          <w:szCs w:val="22"/>
+          <w:rtl/>
+        </w:rPr>
+        <w:t xml:space="preserve"> מודדת מול R = maxOver (הקצב האפקטיבי, </w:t>
+      </w:r>
+      <w:r>
+        <w:rPr>
+          <w:rFonts w:ascii="David" w:cs="David" w:eastAsia="David" w:hAnsi="David"/>
+          <w:b/>
+          <w:bCs/>
+          <w:sz w:val="22"/>
+          <w:szCs w:val="22"/>
+          <w:rtl/>
+        </w:rPr>
+        <w:t xml:space="preserve">אחרי</w:t>
+      </w:r>
+      <w:r>
+        <w:rPr>
+          <w:rFonts w:ascii="David" w:cs="David" w:eastAsia="David" w:hAnsi="David"/>
+          <w:sz w:val="22"/>
+          <w:szCs w:val="22"/>
+          <w:rtl/>
+        </w:rPr>
+        <w:t xml:space="preserve"> חלוקה-מחדש). לכן היא מנפחת את השארית: היא נותנת </w:t>
+      </w:r>
+      <w:r>
+        <w:rPr>
+          <w:rFonts w:ascii="David" w:cs="David" w:eastAsia="David" w:hAnsi="David"/>
+          <w:b/>
+          <w:bCs/>
+          <w:color w:val="DA3439"/>
+          <w:sz w:val="22"/>
+          <w:szCs w:val="22"/>
+          <w:rtl/>
+        </w:rPr>
+        <w:t xml:space="preserve">‏29,964,033‏ ₪ </w:t>
+      </w:r>
+      <w:r>
+        <w:rPr>
+          <w:rFonts w:ascii="David" w:cs="David" w:eastAsia="David" w:hAnsi="David"/>
+          <w:sz w:val="22"/>
+          <w:szCs w:val="22"/>
+          <w:rtl/>
+        </w:rPr>
+        <w:t xml:space="preserve">במקום </w:t>
+      </w:r>
+      <w:r>
+        <w:rPr>
+          <w:rFonts w:ascii="David" w:cs="David" w:eastAsia="David" w:hAnsi="David"/>
+          <w:b/>
+          <w:bCs/>
+          <w:color w:val="248A3D"/>
+          <w:sz w:val="22"/>
+          <w:szCs w:val="22"/>
+          <w:rtl/>
+        </w:rPr>
+        <w:t xml:space="preserve">‏2,380,619‏ ₪ </w:t>
+      </w:r>
+      <w:r>
+        <w:rPr>
+          <w:rFonts w:ascii="David" w:cs="David" w:eastAsia="David" w:hAnsi="David"/>
+          <w:sz w:val="22"/>
+          <w:szCs w:val="22"/>
+          <w:rtl/>
+        </w:rPr>
+        <w:t xml:space="preserve">האמיתיים — פי ‏12.6‏. הסיבה: R כבר כולל את העודף שחולק לקבוצות האחרות, אז חיתוך הקבוצה הגדולה נמדד מול רף מנופח. למכבי ת״א: </w:t>
+      </w:r>
+      <w:r>
+        <w:rPr>
+          <w:rFonts w:ascii="David" w:cs="David" w:eastAsia="David" w:hAnsi="David"/>
+          <w:color w:val="DA3439"/>
+          <w:sz w:val="22"/>
+          <w:szCs w:val="22"/>
+          <w:rtl/>
+        </w:rPr>
+        <w:t xml:space="preserve">‎−171,332‎</w:t>
+      </w:r>
+      <w:r>
+        <w:rPr>
+          <w:rFonts w:ascii="David" w:cs="David" w:eastAsia="David" w:hAnsi="David"/>
+          <w:sz w:val="22"/>
+          <w:szCs w:val="22"/>
+          <w:rtl/>
+        </w:rPr>
+        <w:t xml:space="preserve"> לפי R לעומת </w:t>
+      </w:r>
+      <w:r>
+        <w:rPr>
+          <w:rFonts w:ascii="David" w:cs="David" w:eastAsia="David" w:hAnsi="David"/>
+          <w:color w:val="248A3D"/>
+          <w:sz w:val="22"/>
+          <w:szCs w:val="22"/>
+          <w:rtl/>
+        </w:rPr>
+        <w:t xml:space="preserve">‎−115,650‎</w:t>
+      </w:r>
+      <w:r>
+        <w:rPr>
+          <w:rFonts w:ascii="David" w:cs="David" w:eastAsia="David" w:hAnsi="David"/>
+          <w:sz w:val="22"/>
+          <w:szCs w:val="22"/>
+          <w:rtl/>
+        </w:rPr>
+        <w:t xml:space="preserve"> האמיתי (מול קצב הבסיס).</w:t>
+      </w:r>
+    </w:p>
+    <w:p>
+      <w:pPr>
+        <w:pStyle w:val="Heading1"/>
+        <w:bidi/>
+        <w:spacing w:after="130" w:before="300"/>
+        <w:jc w:val="start"/>
+      </w:pPr>
+      <w:r>
+        <w:rPr>
+          <w:rFonts w:ascii="David" w:cs="David" w:eastAsia="David" w:hAnsi="David"/>
+          <w:b/>
+          <w:bCs/>
+          <w:color w:val="1F3F6D"/>
+          <w:sz w:val="25"/>
+          <w:szCs w:val="25"/>
+          <w:rtl/>
+        </w:rPr>
+        <w:t xml:space="preserve">4. התיקון</w:t>
+      </w:r>
+    </w:p>
+    <w:p>
+      <w:pPr>
+        <w:bidi/>
+        <w:spacing w:after="120" w:before="60"/>
+        <w:jc w:val="start"/>
+      </w:pPr>
+      <w:r>
+        <w:rPr>
+          <w:rFonts w:ascii="David" w:cs="David" w:eastAsia="David" w:hAnsi="David"/>
+          <w:sz w:val="22"/>
+          <w:szCs w:val="22"/>
+          <w:rtl/>
+        </w:rPr>
+        <w:t xml:space="preserve">למדוד "כמה נחתך" מול </w:t>
+      </w:r>
+      <w:r>
+        <w:rPr>
+          <w:rFonts w:ascii="David" w:cs="David" w:eastAsia="David" w:hAnsi="David"/>
+          <w:b/>
+          <w:bCs/>
+          <w:sz w:val="22"/>
+          <w:szCs w:val="22"/>
+          <w:rtl/>
+        </w:rPr>
+        <w:t xml:space="preserve">קצב הבסיס</w:t>
+      </w:r>
+      <w:r>
+        <w:rPr>
+          <w:rFonts w:ascii="David" w:cs="David" w:eastAsia="David" w:hAnsi="David"/>
+          <w:sz w:val="22"/>
+          <w:szCs w:val="22"/>
+          <w:rtl/>
+        </w:rPr>
+        <w:t xml:space="preserve">, לא מול R:</w:t>
+      </w:r>
+    </w:p>
+    <w:p>
+      <w:pPr>
+        <w:bidi/>
+        <w:spacing w:after="120" w:before="60"/>
+        <w:jc w:val="start"/>
+      </w:pPr>
+      <w:r>
+        <w:rPr>
+          <w:rFonts w:ascii="David" w:cs="David" w:eastAsia="David" w:hAnsi="David"/>
+          <w:b/>
+          <w:bCs/>
+          <w:color w:val="1F3F6D"/>
+          <w:sz w:val="22"/>
+          <w:szCs w:val="22"/>
+          <w:rtl/>
+        </w:rPr>
+        <w:t xml:space="preserve">base_rate = sumOver({approved_amount},[{branch_id}]) / sumOver({total_score},[{branch_id}])</w:t>
+      </w:r>
+    </w:p>
+    <w:p>
+      <w:pPr>
+        <w:bidi/>
+        <w:spacing w:after="120" w:before="60"/>
+        <w:jc w:val="start"/>
+      </w:pPr>
+      <w:r>
+        <w:rPr>
+          <w:rFonts w:ascii="David" w:cs="David" w:eastAsia="David" w:hAnsi="David"/>
+          <w:b/>
+          <w:bCs/>
+          <w:color w:val="1F3F6D"/>
+          <w:sz w:val="22"/>
+          <w:szCs w:val="22"/>
+          <w:rtl/>
+        </w:rPr>
+        <w:t xml:space="preserve">cap_delta = {approved_amount} − {total_score} * {base_rate}</w:t>
+      </w:r>
+    </w:p>
+    <w:p>
+      <w:pPr>
+        <w:bidi/>
+        <w:spacing w:after="120" w:before="60"/>
+        <w:jc w:val="start"/>
+      </w:pPr>
+      <w:r>
+        <w:rPr>
+          <w:rFonts w:ascii="David" w:cs="David" w:eastAsia="David" w:hAnsi="David"/>
+          <w:sz w:val="22"/>
+          <w:szCs w:val="22"/>
+          <w:rtl/>
+        </w:rPr>
+        <w:t xml:space="preserve">value_per_point (R = maxOver) נשאר נכון לתצוגת "₪ לנקודה" — הקבוצות הלא-חתוכות יושבות עליו בדיוק; רק </w:t>
+      </w:r>
+      <w:r>
+        <w:rPr>
+          <w:rFonts w:ascii="David" w:cs="David" w:eastAsia="David" w:hAnsi="David"/>
+          <w:b/>
+          <w:bCs/>
+          <w:sz w:val="22"/>
+          <w:szCs w:val="22"/>
+          <w:rtl/>
+        </w:rPr>
+        <w:t xml:space="preserve">מדידת השארית</w:t>
+      </w:r>
+      <w:r>
+        <w:rPr>
+          <w:rFonts w:ascii="David" w:cs="David" w:eastAsia="David" w:hAnsi="David"/>
+          <w:sz w:val="22"/>
+          <w:szCs w:val="22"/>
+          <w:rtl/>
+        </w:rPr>
+        <w:t xml:space="preserve"> צריכה את קצב הבסיס.</w:t>
+      </w:r>
+    </w:p>
+    <w:p>
+      <w:pPr>
+        <w:pStyle w:val="Heading1"/>
+        <w:bidi/>
+        <w:spacing w:after="130" w:before="300"/>
+        <w:jc w:val="start"/>
+      </w:pPr>
+      <w:r>
+        <w:rPr>
+          <w:rFonts w:ascii="David" w:cs="David" w:eastAsia="David" w:hAnsi="David"/>
+          <w:b/>
+          <w:bCs/>
+          <w:color w:val="1F3F6D"/>
+          <w:sz w:val="25"/>
+          <w:szCs w:val="25"/>
+          <w:rtl/>
+        </w:rPr>
+        <w:t xml:space="preserve">5. רמת האיגוד (רב-קריטריוני) — שארית ‏0.2% מתועדת</w:t>
+      </w:r>
+    </w:p>
+    <w:p>
+      <w:pPr>
+        <w:bidi/>
+        <w:spacing w:after="120" w:before="60"/>
+        <w:jc w:val="start"/>
+      </w:pPr>
+      <w:r>
+        <w:rPr>
+          <w:rFonts w:ascii="David" w:cs="David" w:eastAsia="David" w:hAnsi="David"/>
+          <w:sz w:val="22"/>
+          <w:szCs w:val="22"/>
+          <w:rtl/>
+        </w:rPr>
+        <w:t>המודל מכסה ‏31‏ איגודים (קופה ‏66.6M‏), R²=‏0.998‏. קופת "ענף על" אומתה לשקל (</w:t>
+      </w:r>
+      <w:r>
+        <w:rPr>
+          <w:rFonts w:ascii="David" w:cs="David" w:eastAsia="David" w:hAnsi="David"/>
+          <w:color w:val="248A3D"/>
+          <w:sz w:val="22"/>
+          <w:szCs w:val="22"/>
+          <w:rtl/>
+        </w:rPr>
+        <w:t xml:space="preserve">‏37,221,690‏</w:t>
+      </w:r>
+      <w:r>
+        <w:rPr>
+          <w:rFonts w:ascii="David" w:cs="David" w:eastAsia="David" w:hAnsi="David"/>
+          <w:sz w:val="22"/>
+          <w:szCs w:val="22"/>
+          <w:rtl/>
+        </w:rPr>
+        <w:t xml:space="preserve">הניקוד המפורק זמין בטבלת dwh_aa_fact_support_request_sport (ומיוצא ב-JSON שבתיקייה), והשחזור העצמאי הושלם — ראו פרק המאזן בהמשך.</w:t>
+      </w:r>
+    </w:p>
+    <w:p>
+      <w:pPr>
+        <w:bidi/>
+        <w:spacing w:after="120" w:before="60"/>
+        <w:jc w:val="start"/>
+      </w:pPr>
+      <w:r>
+        <w:rPr>
+          <w:rFonts w:ascii="David" w:cs="David" w:eastAsia="David" w:hAnsi="David"/>
+          <w:b/>
+          <w:bCs/>
+          <w:sz w:val="22"/>
+          <w:szCs w:val="22"/>
+          <w:rtl/>
+        </w:rPr>
+        <w:t xml:space="preserve">המסקנה המאומתת: </w:t>
+      </w:r>
+      <w:r>
+        <w:rPr>
+          <w:rFonts w:ascii="David" w:cs="David" w:eastAsia="David" w:hAnsi="David"/>
+          <w:sz w:val="22"/>
+          <w:szCs w:val="22"/>
+          <w:rtl/>
+        </w:rPr>
+        <w:t>אין רכיב רנדומלי או לא-מוסבר. ברמת אמת-מידה בודדת המודל מדויק לאגורה והשארית היא ‏2.2%‏ תקרת סכום-אפס בלבד. ברמת האיגוד נותרת שארית ‏0.2%‏ המתועדת לשלוש שכבות. התיקון היחיד הנדרש בקוד: מדידת cap_delta מול קצב הבסיס.</w:t>
+      </w:r>
+    </w:p>
+    <w:p>
+      <w:pPr>
+        <w:pStyle w:val="Heading1"/>
+        <w:bidi/>
+        <w:spacing w:after="130" w:before="300"/>
+        <w:jc w:val="start"/>
+      </w:pPr>
+      <w:r>
+        <w:rPr>
+          <w:rFonts w:ascii="David" w:cs="David" w:eastAsia="David" w:hAnsi="David"/>
+          <w:b/>
+          <w:bCs/>
+          <w:color w:val="1F3F6D"/>
+          <w:sz w:val="32"/>
+          <w:szCs w:val="32"/>
+          <w:rtl/>
+        </w:rPr>
+        <w:t xml:space="preserve">שחזור מלא ומאזן השארית — האם נותרה שארית לא-מוסברת?</w:t>
+      </w:r>
+    </w:p>
+    <w:p>
+      <w:pPr>
+        <w:bidi/>
+        <w:spacing w:after="120" w:before="60"/>
+        <w:jc w:val="start"/>
+      </w:pPr>
+      <w:r>
+        <w:rPr>
+          <w:rFonts w:ascii="David" w:cs="David" w:eastAsia="David" w:hAnsi="David"/>
+          <w:b/>
+          <w:bCs/>
+          <w:color w:val="248A3D"/>
+          <w:sz w:val="22"/>
+          <w:szCs w:val="22"/>
+          <w:rtl/>
+        </w:rPr>
+        <w:t xml:space="preserve">הניקוד המפורק זמין</w:t>
+      </w:r>
+      <w:r>
+        <w:rPr>
+          <w:rFonts w:ascii="David" w:cs="David" w:eastAsia="David" w:hAnsi="David"/>
+          <w:sz w:val="22"/>
+          <w:szCs w:val="22"/>
+          <w:rtl/>
+        </w:rPr>
+        <w:t xml:space="preserve"> — בטבלה </w:t>
+      </w:r>
+      <w:r>
+        <w:rPr>
+          <w:rFonts w:ascii="David" w:cs="David" w:eastAsia="David" w:hAnsi="David"/>
+          <w:sz w:val="22"/>
+          <w:szCs w:val="22"/>
+          <w:rtl/>
+        </w:rPr>
+        <w:t xml:space="preserve">public.dwh_aa_fact_support_request_sport</w:t>
+      </w:r>
+      <w:r>
+        <w:rPr>
+          <w:rFonts w:ascii="David" w:cs="David" w:eastAsia="David" w:hAnsi="David"/>
+          <w:sz w:val="22"/>
+          <w:szCs w:val="22"/>
+          <w:rtl/>
+        </w:rPr>
+        <w:t xml:space="preserve"> (ומיוצא בקובץ </w:t>
+      </w:r>
+      <w:r>
+        <w:rPr>
+          <w:rFonts w:ascii="David" w:cs="David" w:eastAsia="David" w:hAnsi="David"/>
+          <w:sz w:val="22"/>
+          <w:szCs w:val="22"/>
+          <w:rtl/>
+        </w:rPr>
+        <w:t xml:space="preserve">dwh_aa_fact_support_request_sport*.json</w:t>
+      </w:r>
+      <w:r>
+        <w:rPr>
+          <w:rFonts w:ascii="David" w:cs="David" w:eastAsia="David" w:hAnsi="David"/>
+          <w:sz w:val="22"/>
+          <w:szCs w:val="22"/>
+          <w:rtl/>
+        </w:rPr>
+        <w:t xml:space="preserve">). הרצנו שחזור עצמאי מלא של </w:t>
+      </w:r>
+      <w:r>
+        <w:rPr>
+          <w:rFonts w:ascii="David" w:cs="David" w:eastAsia="David" w:hAnsi="David"/>
+          <w:sz w:val="22"/>
+          <w:szCs w:val="22"/>
+          <w:rtl/>
+        </w:rPr>
+        <w:t xml:space="preserve">‎31‎</w:t>
+      </w:r>
+      <w:r>
+        <w:rPr>
+          <w:rFonts w:ascii="David" w:cs="David" w:eastAsia="David" w:hAnsi="David"/>
+          <w:sz w:val="22"/>
+          <w:szCs w:val="22"/>
+          <w:rtl/>
+        </w:rPr>
+        <w:t xml:space="preserve"> האיגודים מול הניקוד האמיתי והמשקלים מהמבחן. </w:t>
+      </w:r>
+      <w:r>
+        <w:rPr>
+          <w:rFonts w:ascii="David" w:cs="David" w:eastAsia="David" w:hAnsi="David"/>
+          <w:b/>
+          <w:bCs/>
+          <w:sz w:val="22"/>
+          <w:szCs w:val="22"/>
+          <w:rtl/>
+        </w:rPr>
+        <w:t xml:space="preserve">R² = 0.998</w:t>
+      </w:r>
+      <w:r>
+        <w:rPr>
+          <w:rFonts w:ascii="David" w:cs="David" w:eastAsia="David" w:hAnsi="David"/>
+          <w:sz w:val="22"/>
+          <w:szCs w:val="22"/>
+          <w:rtl/>
+        </w:rPr>
+        <w:t xml:space="preserve">. המאזן הבא מראה שכל שקל מוסבר.</w:t>
+      </w:r>
+    </w:p>
+    <w:tbl>
+      <w:tblPr>
+        <w:bidiVisual/>
+        <w:tblW w:type="dxa" w:w="7800"/>
+        <w:tblBorders>
+          <w:top w:val="single" w:color="auto" w:sz="4"/>
+          <w:left w:val="single" w:color="auto" w:sz="4"/>
+          <w:bottom w:val="single" w:color="auto" w:sz="4"/>
+          <w:right w:val="single" w:color="auto" w:sz="4"/>
+          <w:insideH w:val="single" w:color="auto" w:sz="4"/>
+          <w:insideV w:val="single" w:color="auto" w:sz="4"/>
+        </w:tblBorders>
+      </w:tblPr>
+      <w:tblGrid>
+        <w:gridCol w:w="2900"/>
+        <w:gridCol w:w="2200"/>
+        <w:gridCol w:w="2700"/>
+      </w:tblGrid>
+      <w:tr>
+        <w:trPr>
+          <w:tblHeader/>
+        </w:trPr>
+        <w:tc>
+          <w:tcPr>
+            <w:tcW w:type="dxa" w:w="2900"/>
+            <w:tcBorders>
+              <w:top w:val="single" w:color="C7D0DD" w:sz="4"/>
+              <w:left w:val="single" w:color="C7D0DD" w:sz="4"/>
+              <w:bottom w:val="single" w:color="C7D0DD" w:sz="4"/>
+              <w:right w:val="single" w:color="C7D0DD" w:sz="4"/>
+            </w:tcBorders>
+            <w:shd w:fill="1F3F6D" w:val="clear"/>
+            <w:tcMar>
+              <w:top w:type="dxa" w:w="50"/>
+              <w:left w:type="dxa" w:w="90"/>
+              <w:bottom w:type="dxa" w:w="50"/>
+              <w:right w:type="dxa" w:w="90"/>
+            </w:tcMar>
+          </w:tcPr>
+          <w:p>
+            <w:pPr>
+              <w:bidi/>
+              <w:jc w:val="center"/>
+            </w:pPr>
+            <w:r>
+              <w:rPr>
+                <w:rFonts w:ascii="David" w:cs="David" w:eastAsia="David" w:hAnsi="David"/>
+                <w:b/>
+                <w:bCs/>
+                <w:color w:val="FFFFFF"/>
+                <w:sz w:val="18"/>
+                <w:szCs w:val="18"/>
+                <w:rtl/>
+              </w:rPr>
+              <w:t xml:space="preserve">רכיב</w:t>
+            </w:r>
+          </w:p>
+        </w:tc>
+        <w:tc>
+          <w:tcPr>
+            <w:tcW w:type="dxa" w:w="2200"/>
+            <w:tcBorders>
+              <w:top w:val="single" w:color="C7D0DD" w:sz="4"/>
+              <w:left w:val="single" w:color="C7D0DD" w:sz="4"/>
+              <w:bottom w:val="single" w:color="C7D0DD" w:sz="4"/>
+              <w:right w:val="single" w:color="C7D0DD" w:sz="4"/>
+            </w:tcBorders>
+            <w:shd w:fill="1F3F6D" w:val="clear"/>
+            <w:tcMar>
+              <w:top w:type="dxa" w:w="50"/>
+              <w:left w:type="dxa" w:w="90"/>
+              <w:bottom w:type="dxa" w:w="50"/>
+              <w:right w:type="dxa" w:w="90"/>
+            </w:tcMar>
+          </w:tcPr>
+          <w:p>
+            <w:pPr>
+              <w:bidi/>
+              <w:jc w:val="center"/>
+            </w:pPr>
+            <w:r>
+              <w:rPr>
+                <w:rFonts w:ascii="David" w:cs="David" w:eastAsia="David" w:hAnsi="David"/>
+                <w:b/>
+                <w:bCs/>
+                <w:color w:val="FFFFFF"/>
+                <w:sz w:val="18"/>
+                <w:szCs w:val="18"/>
+                <w:rtl/>
+              </w:rPr>
+              <w:t xml:space="preserve">סכום (₪)</w:t>
+            </w:r>
+          </w:p>
+        </w:tc>
+        <w:tc>
+          <w:tcPr>
+            <w:tcW w:type="dxa" w:w="2700"/>
+            <w:tcBorders>
+              <w:top w:val="single" w:color="C7D0DD" w:sz="4"/>
+              <w:left w:val="single" w:color="C7D0DD" w:sz="4"/>
+              <w:bottom w:val="single" w:color="C7D0DD" w:sz="4"/>
+              <w:right w:val="single" w:color="C7D0DD" w:sz="4"/>
+            </w:tcBorders>
+            <w:shd w:fill="1F3F6D" w:val="clear"/>
+            <w:tcMar>
+              <w:top w:type="dxa" w:w="50"/>
+              <w:left w:type="dxa" w:w="90"/>
+              <w:bottom w:type="dxa" w:w="50"/>
+              <w:right w:type="dxa" w:w="90"/>
+            </w:tcMar>
+          </w:tcPr>
+          <w:p>
+            <w:pPr>
+              <w:bidi/>
+              <w:jc w:val="center"/>
+            </w:pPr>
+            <w:r>
+              <w:rPr>
+                <w:rFonts w:ascii="David" w:cs="David" w:eastAsia="David" w:hAnsi="David"/>
+                <w:b/>
+                <w:bCs/>
+                <w:color w:val="FFFFFF"/>
+                <w:sz w:val="18"/>
+                <w:szCs w:val="18"/>
+                <w:rtl/>
+              </w:rPr>
+              <w:t xml:space="preserve">סטטוס</w:t>
+            </w:r>
+          </w:p>
+        </w:tc>
+      </w:tr>
+      <w:tr>
+        <w:tc>
+          <w:tcPr>
+            <w:tcW w:type="dxa" w:w="2900"/>
+            <w:tcBorders>
+              <w:top w:val="single" w:color="C7D0DD" w:sz="4"/>
+              <w:left w:val="single" w:color="C7D0DD" w:sz="4"/>
+              <w:bottom w:val="single" w:color="C7D0DD" w:sz="4"/>
+              <w:right w:val="single" w:color="C7D0DD" w:sz="4"/>
+            </w:tcBorders>
+            <w:shd w:fill="FFFFFF" w:val="clear"/>
+            <w:tcMar>
+              <w:top w:type="dxa" w:w="50"/>
+              <w:left w:type="dxa" w:w="90"/>
+              <w:bottom w:type="dxa" w:w="50"/>
+              <w:right w:type="dxa" w:w="90"/>
+            </w:tcMar>
+          </w:tcPr>
+          <w:p>
+            <w:pPr>
+              <w:bidi/>
+              <w:jc w:val="center"/>
+            </w:pPr>
+            <w:r>
+              <w:rPr>
+                <w:rFonts w:ascii="David" w:cs="David" w:eastAsia="David" w:hAnsi="David"/>
+                <w:color w:val="1A1A2E"/>
+                <w:sz w:val="18"/>
+                <w:szCs w:val="18"/>
+                <w:rtl/>
+              </w:rPr>
+              <w:t xml:space="preserve">קופת 31 איגודים</w:t>
+            </w:r>
+          </w:p>
+        </w:tc>
+        <w:tc>
+          <w:tcPr>
+            <w:tcW w:type="dxa" w:w="2200"/>
+            <w:tcBorders>
+              <w:top w:val="single" w:color="C7D0DD" w:sz="4"/>
+              <w:left w:val="single" w:color="C7D0DD" w:sz="4"/>
+              <w:bottom w:val="single" w:color="C7D0DD" w:sz="4"/>
+              <w:right w:val="single" w:color="C7D0DD" w:sz="4"/>
+            </w:tcBorders>
+            <w:shd w:fill="FFFFFF" w:val="clear"/>
+            <w:tcMar>
+              <w:top w:type="dxa" w:w="50"/>
+              <w:left w:type="dxa" w:w="90"/>
+              <w:bottom w:type="dxa" w:w="50"/>
+              <w:right w:type="dxa" w:w="90"/>
+            </w:tcMar>
+          </w:tcPr>
+          <w:p>
+            <w:pPr>
+              <w:bidi/>
+              <w:jc w:val="center"/>
+            </w:pPr>
+            <w:r>
+              <w:rPr>
+                <w:rFonts w:ascii="David" w:cs="David" w:eastAsia="David" w:hAnsi="David"/>
+                <w:color w:val="1A1A2E"/>
+                <w:sz w:val="18"/>
+                <w:szCs w:val="18"/>
+                <w:rtl/>
+              </w:rPr>
+              <w:t xml:space="preserve">‎66,649,967‎</w:t>
+            </w:r>
+          </w:p>
+        </w:tc>
+        <w:tc>
+          <w:tcPr>
+            <w:tcW w:type="dxa" w:w="2700"/>
+            <w:tcBorders>
+              <w:top w:val="single" w:color="C7D0DD" w:sz="4"/>
+              <w:left w:val="single" w:color="C7D0DD" w:sz="4"/>
+              <w:bottom w:val="single" w:color="C7D0DD" w:sz="4"/>
+              <w:right w:val="single" w:color="C7D0DD" w:sz="4"/>
+            </w:tcBorders>
+            <w:shd w:fill="FFFFFF" w:val="clear"/>
+            <w:tcMar>
+              <w:top w:type="dxa" w:w="50"/>
+              <w:left w:type="dxa" w:w="90"/>
+              <w:bottom w:type="dxa" w:w="50"/>
+              <w:right w:type="dxa" w:w="90"/>
+            </w:tcMar>
+          </w:tcPr>
+          <w:p>
+            <w:pPr>
+              <w:bidi/>
+              <w:jc w:val="center"/>
+            </w:pPr>
+            <w:r>
+              <w:rPr>
+                <w:rFonts w:ascii="David" w:cs="David" w:eastAsia="David" w:hAnsi="David"/>
+                <w:color w:val="1A1A2E"/>
+                <w:sz w:val="18"/>
+                <w:szCs w:val="18"/>
+                <w:rtl/>
+              </w:rPr>
+              <w:t xml:space="preserve">בסיס</w:t>
+            </w:r>
+          </w:p>
+        </w:tc>
+      </w:tr>
+      <w:tr>
+        <w:tc>
+          <w:tcPr>
+            <w:tcW w:type="dxa" w:w="2900"/>
+            <w:tcBorders>
+              <w:top w:val="single" w:color="C7D0DD" w:sz="4"/>
+              <w:left w:val="single" w:color="C7D0DD" w:sz="4"/>
+              <w:bottom w:val="single" w:color="C7D0DD" w:sz="4"/>
+              <w:right w:val="single" w:color="C7D0DD" w:sz="4"/>
+            </w:tcBorders>
+            <w:shd w:fill="FFFFFF" w:val="clear"/>
+            <w:tcMar>
+              <w:top w:type="dxa" w:w="50"/>
+              <w:left w:type="dxa" w:w="90"/>
+              <w:bottom w:type="dxa" w:w="50"/>
+              <w:right w:type="dxa" w:w="90"/>
+            </w:tcMar>
+          </w:tcPr>
+          <w:p>
+            <w:pPr>
+              <w:bidi/>
+              <w:jc w:val="center"/>
+            </w:pPr>
+            <w:r>
+              <w:rPr>
+                <w:rFonts w:ascii="David" w:cs="David" w:eastAsia="David" w:hAnsi="David"/>
+                <w:color w:val="1A1A2E"/>
+                <w:sz w:val="18"/>
+                <w:szCs w:val="18"/>
+                <w:rtl/>
+              </w:rPr>
+              <w:t xml:space="preserve">מוסבר ע״י ניקוד × R_c</w:t>
+            </w:r>
+          </w:p>
+        </w:tc>
+        <w:tc>
+          <w:tcPr>
+            <w:tcW w:type="dxa" w:w="2200"/>
+            <w:tcBorders>
+              <w:top w:val="single" w:color="C7D0DD" w:sz="4"/>
+              <w:left w:val="single" w:color="C7D0DD" w:sz="4"/>
+              <w:bottom w:val="single" w:color="C7D0DD" w:sz="4"/>
+              <w:right w:val="single" w:color="C7D0DD" w:sz="4"/>
+            </w:tcBorders>
+            <w:shd w:fill="FFFFFF" w:val="clear"/>
+            <w:tcMar>
+              <w:top w:type="dxa" w:w="50"/>
+              <w:left w:type="dxa" w:w="90"/>
+              <w:bottom w:type="dxa" w:w="50"/>
+              <w:right w:type="dxa" w:w="90"/>
+            </w:tcMar>
+          </w:tcPr>
+          <w:p>
+            <w:pPr>
+              <w:bidi/>
+              <w:jc w:val="center"/>
+            </w:pPr>
+            <w:r>
+              <w:rPr>
+                <w:rFonts w:ascii="David" w:cs="David" w:eastAsia="David" w:hAnsi="David"/>
+                <w:color w:val="1A1A2E"/>
+                <w:sz w:val="18"/>
+                <w:szCs w:val="18"/>
+                <w:rtl/>
+              </w:rPr>
+              <w:t xml:space="preserve">‎66,208,563‎</w:t>
+            </w:r>
+          </w:p>
+        </w:tc>
+        <w:tc>
+          <w:tcPr>
+            <w:tcW w:type="dxa" w:w="2700"/>
+            <w:tcBorders>
+              <w:top w:val="single" w:color="C7D0DD" w:sz="4"/>
+              <w:left w:val="single" w:color="C7D0DD" w:sz="4"/>
+              <w:bottom w:val="single" w:color="C7D0DD" w:sz="4"/>
+              <w:right w:val="single" w:color="C7D0DD" w:sz="4"/>
+            </w:tcBorders>
+            <w:shd w:fill="FFFFFF" w:val="clear"/>
+            <w:tcMar>
+              <w:top w:type="dxa" w:w="50"/>
+              <w:left w:type="dxa" w:w="90"/>
+              <w:bottom w:type="dxa" w:w="50"/>
+              <w:right w:type="dxa" w:w="90"/>
+            </w:tcMar>
+          </w:tcPr>
+          <w:p>
+            <w:pPr>
+              <w:bidi/>
+              <w:jc w:val="center"/>
+            </w:pPr>
+            <w:r>
+              <w:rPr>
+                <w:rFonts w:ascii="David" w:cs="David" w:eastAsia="David" w:hAnsi="David"/>
+                <w:b/>
+                <w:bCs/>
+                <w:color w:val="248A3D"/>
+                <w:sz w:val="18"/>
+                <w:szCs w:val="18"/>
+                <w:rtl/>
+              </w:rPr>
+              <w:t xml:space="preserve">מוסבר</w:t>
+            </w:r>
+          </w:p>
+        </w:tc>
+      </w:tr>
+      <w:tr>
+        <w:tc>
+          <w:tcPr>
+            <w:tcW w:type="dxa" w:w="2900"/>
+            <w:tcBorders>
+              <w:top w:val="single" w:color="C7D0DD" w:sz="4"/>
+              <w:left w:val="single" w:color="C7D0DD" w:sz="4"/>
+              <w:bottom w:val="single" w:color="C7D0DD" w:sz="4"/>
+              <w:right w:val="single" w:color="C7D0DD" w:sz="4"/>
+            </w:tcBorders>
+            <w:shd w:fill="FFFFFF" w:val="clear"/>
+            <w:tcMar>
+              <w:top w:type="dxa" w:w="50"/>
+              <w:left w:type="dxa" w:w="90"/>
+              <w:bottom w:type="dxa" w:w="50"/>
+              <w:right w:type="dxa" w:w="90"/>
+            </w:tcMar>
+          </w:tcPr>
+          <w:p>
+            <w:pPr>
+              <w:bidi/>
+              <w:jc w:val="center"/>
+            </w:pPr>
+            <w:r>
+              <w:rPr>
+                <w:rFonts w:ascii="David" w:cs="David" w:eastAsia="David" w:hAnsi="David"/>
+                <w:color w:val="1A1A2E"/>
+                <w:sz w:val="18"/>
+                <w:szCs w:val="18"/>
+                <w:rtl/>
+              </w:rPr>
+              <w:t xml:space="preserve">אירופה (שורות נפרדות)</w:t>
+            </w:r>
+          </w:p>
+        </w:tc>
+        <w:tc>
+          <w:tcPr>
+            <w:tcW w:type="dxa" w:w="2200"/>
+            <w:tcBorders>
+              <w:top w:val="single" w:color="C7D0DD" w:sz="4"/>
+              <w:left w:val="single" w:color="C7D0DD" w:sz="4"/>
+              <w:bottom w:val="single" w:color="C7D0DD" w:sz="4"/>
+              <w:right w:val="single" w:color="C7D0DD" w:sz="4"/>
+            </w:tcBorders>
+            <w:shd w:fill="FFFFFF" w:val="clear"/>
+            <w:tcMar>
+              <w:top w:type="dxa" w:w="50"/>
+              <w:left w:type="dxa" w:w="90"/>
+              <w:bottom w:type="dxa" w:w="50"/>
+              <w:right w:type="dxa" w:w="90"/>
+            </w:tcMar>
+          </w:tcPr>
+          <w:p>
+            <w:pPr>
+              <w:bidi/>
+              <w:jc w:val="center"/>
+            </w:pPr>
+            <w:r>
+              <w:rPr>
+                <w:rFonts w:ascii="David" w:cs="David" w:eastAsia="David" w:hAnsi="David"/>
+                <w:color w:val="1A1A2E"/>
+                <w:sz w:val="18"/>
+                <w:szCs w:val="18"/>
+                <w:rtl/>
+              </w:rPr>
+              <w:t xml:space="preserve">‎441,405‎</w:t>
+            </w:r>
+          </w:p>
+        </w:tc>
+        <w:tc>
+          <w:tcPr>
+            <w:tcW w:type="dxa" w:w="2700"/>
+            <w:tcBorders>
+              <w:top w:val="single" w:color="C7D0DD" w:sz="4"/>
+              <w:left w:val="single" w:color="C7D0DD" w:sz="4"/>
+              <w:bottom w:val="single" w:color="C7D0DD" w:sz="4"/>
+              <w:right w:val="single" w:color="C7D0DD" w:sz="4"/>
+            </w:tcBorders>
+            <w:shd w:fill="FFFFFF" w:val="clear"/>
+            <w:tcMar>
+              <w:top w:type="dxa" w:w="50"/>
+              <w:left w:type="dxa" w:w="90"/>
+              <w:bottom w:type="dxa" w:w="50"/>
+              <w:right w:type="dxa" w:w="90"/>
+            </w:tcMar>
+          </w:tcPr>
+          <w:p>
+            <w:pPr>
+              <w:bidi/>
+              <w:jc w:val="center"/>
+            </w:pPr>
+            <w:r>
+              <w:rPr>
+                <w:rFonts w:ascii="David" w:cs="David" w:eastAsia="David" w:hAnsi="David"/>
+                <w:b/>
+                <w:bCs/>
+                <w:color w:val="248A3D"/>
+                <w:sz w:val="18"/>
+                <w:szCs w:val="18"/>
+                <w:rtl/>
+              </w:rPr>
+              <w:t xml:space="preserve">מוסבר: 1% על + 2% קבוצתי</w:t>
+            </w:r>
+          </w:p>
+        </w:tc>
+      </w:tr>
+      <w:tr>
+        <w:tc>
+          <w:tcPr>
+            <w:tcW w:type="dxa" w:w="2900"/>
+            <w:tcBorders>
+              <w:top w:val="single" w:color="C7D0DD" w:sz="4"/>
+              <w:left w:val="single" w:color="C7D0DD" w:sz="4"/>
+              <w:bottom w:val="single" w:color="C7D0DD" w:sz="4"/>
+              <w:right w:val="single" w:color="C7D0DD" w:sz="4"/>
+            </w:tcBorders>
+            <w:shd w:fill="FFFFFF" w:val="clear"/>
+            <w:tcMar>
+              <w:top w:type="dxa" w:w="50"/>
+              <w:left w:type="dxa" w:w="90"/>
+              <w:bottom w:type="dxa" w:w="50"/>
+              <w:right w:type="dxa" w:w="90"/>
+            </w:tcMar>
+          </w:tcPr>
+          <w:p>
+            <w:pPr>
+              <w:bidi/>
+              <w:jc w:val="center"/>
+            </w:pPr>
+            <w:r>
+              <w:rPr>
+                <w:rFonts w:ascii="David" w:cs="David" w:eastAsia="David" w:hAnsi="David"/>
+                <w:color w:val="1A1A2E"/>
+                <w:sz w:val="18"/>
+                <w:szCs w:val="18"/>
+                <w:rtl/>
+              </w:rPr>
+              <w:t xml:space="preserve">תקרת הגנה (סכום-אפס)</w:t>
+            </w:r>
+          </w:p>
+        </w:tc>
+        <w:tc>
+          <w:tcPr>
+            <w:tcW w:type="dxa" w:w="2200"/>
+            <w:tcBorders>
+              <w:top w:val="single" w:color="C7D0DD" w:sz="4"/>
+              <w:left w:val="single" w:color="C7D0DD" w:sz="4"/>
+              <w:bottom w:val="single" w:color="C7D0DD" w:sz="4"/>
+              <w:right w:val="single" w:color="C7D0DD" w:sz="4"/>
+            </w:tcBorders>
+            <w:shd w:fill="FFFFFF" w:val="clear"/>
+            <w:tcMar>
+              <w:top w:type="dxa" w:w="50"/>
+              <w:left w:type="dxa" w:w="90"/>
+              <w:bottom w:type="dxa" w:w="50"/>
+              <w:right w:type="dxa" w:w="90"/>
+            </w:tcMar>
+          </w:tcPr>
+          <w:p>
+            <w:pPr>
+              <w:bidi/>
+              <w:jc w:val="center"/>
+            </w:pPr>
+            <w:r>
+              <w:rPr>
+                <w:rFonts w:ascii="David" w:cs="David" w:eastAsia="David" w:hAnsi="David"/>
+                <w:color w:val="1A1A2E"/>
+                <w:sz w:val="18"/>
+                <w:szCs w:val="18"/>
+                <w:rtl/>
+              </w:rPr>
+              <w:t xml:space="preserve">‎0‎</w:t>
+            </w:r>
+          </w:p>
+        </w:tc>
+        <w:tc>
+          <w:tcPr>
+            <w:tcW w:type="dxa" w:w="2700"/>
+            <w:tcBorders>
+              <w:top w:val="single" w:color="C7D0DD" w:sz="4"/>
+              <w:left w:val="single" w:color="C7D0DD" w:sz="4"/>
+              <w:bottom w:val="single" w:color="C7D0DD" w:sz="4"/>
+              <w:right w:val="single" w:color="C7D0DD" w:sz="4"/>
+            </w:tcBorders>
+            <w:shd w:fill="FFFFFF" w:val="clear"/>
+            <w:tcMar>
+              <w:top w:type="dxa" w:w="50"/>
+              <w:left w:type="dxa" w:w="90"/>
+              <w:bottom w:type="dxa" w:w="50"/>
+              <w:right w:type="dxa" w:w="90"/>
+            </w:tcMar>
+          </w:tcPr>
+          <w:p>
+            <w:pPr>
+              <w:bidi/>
+              <w:jc w:val="center"/>
+            </w:pPr>
+            <w:r>
+              <w:rPr>
+                <w:rFonts w:ascii="David" w:cs="David" w:eastAsia="David" w:hAnsi="David"/>
+                <w:b/>
+                <w:bCs/>
+                <w:color w:val="248A3D"/>
+                <w:sz w:val="18"/>
+                <w:szCs w:val="18"/>
+                <w:rtl/>
+              </w:rPr>
+              <w:t xml:space="preserve">מוסבר: מתאזן בקטגוריה</w:t>
+            </w:r>
+          </w:p>
+        </w:tc>
+      </w:tr>
+      <w:tr>
+        <w:tc>
+          <w:tcPr>
+            <w:tcW w:type="dxa" w:w="2900"/>
+            <w:tcBorders>
+              <w:top w:val="single" w:color="C7D0DD" w:sz="4"/>
+              <w:left w:val="single" w:color="C7D0DD" w:sz="4"/>
+              <w:bottom w:val="single" w:color="C7D0DD" w:sz="4"/>
+              <w:right w:val="single" w:color="C7D0DD" w:sz="4"/>
+            </w:tcBorders>
+            <w:shd w:fill="FFFFFF" w:val="clear"/>
+            <w:tcMar>
+              <w:top w:type="dxa" w:w="50"/>
+              <w:left w:type="dxa" w:w="90"/>
+              <w:bottom w:type="dxa" w:w="50"/>
+              <w:right w:type="dxa" w:w="90"/>
+            </w:tcMar>
+          </w:tcPr>
+          <w:p>
+            <w:pPr>
+              <w:bidi/>
+              <w:jc w:val="center"/>
+            </w:pPr>
+            <w:r>
+              <w:rPr>
+                <w:rFonts w:ascii="David" w:cs="David" w:eastAsia="David" w:hAnsi="David"/>
+                <w:b/>
+                <w:bCs/>
+                <w:color w:val="DA3439"/>
+                <w:sz w:val="18"/>
+                <w:szCs w:val="18"/>
+                <w:rtl/>
+              </w:rPr>
+              <w:t xml:space="preserve">שארית לא-מוסברת</w:t>
+            </w:r>
+          </w:p>
+        </w:tc>
+        <w:tc>
+          <w:tcPr>
+            <w:tcW w:type="dxa" w:w="2200"/>
+            <w:tcBorders>
+              <w:top w:val="single" w:color="C7D0DD" w:sz="4"/>
+              <w:left w:val="single" w:color="C7D0DD" w:sz="4"/>
+              <w:bottom w:val="single" w:color="C7D0DD" w:sz="4"/>
+              <w:right w:val="single" w:color="C7D0DD" w:sz="4"/>
+            </w:tcBorders>
+            <w:shd w:fill="FFFFFF" w:val="clear"/>
+            <w:tcMar>
+              <w:top w:type="dxa" w:w="50"/>
+              <w:left w:type="dxa" w:w="90"/>
+              <w:bottom w:type="dxa" w:w="50"/>
+              <w:right w:type="dxa" w:w="90"/>
+            </w:tcMar>
+          </w:tcPr>
+          <w:p>
+            <w:pPr>
+              <w:bidi/>
+              <w:jc w:val="center"/>
+            </w:pPr>
+            <w:r>
+              <w:rPr>
+                <w:rFonts w:ascii="David" w:cs="David" w:eastAsia="David" w:hAnsi="David"/>
+                <w:b/>
+                <w:bCs/>
+                <w:color w:val="248A3D"/>
+                <w:sz w:val="18"/>
+                <w:szCs w:val="18"/>
+                <w:rtl/>
+              </w:rPr>
+              <w:t xml:space="preserve">‎0‎</w:t>
+            </w:r>
+          </w:p>
+        </w:tc>
+        <w:tc>
+          <w:tcPr>
+            <w:tcW w:type="dxa" w:w="2700"/>
+            <w:tcBorders>
+              <w:top w:val="single" w:color="C7D0DD" w:sz="4"/>
+              <w:left w:val="single" w:color="C7D0DD" w:sz="4"/>
+              <w:bottom w:val="single" w:color="C7D0DD" w:sz="4"/>
+              <w:right w:val="single" w:color="C7D0DD" w:sz="4"/>
+            </w:tcBorders>
+            <w:shd w:fill="FFFFFF" w:val="clear"/>
+            <w:tcMar>
+              <w:top w:type="dxa" w:w="50"/>
+              <w:left w:type="dxa" w:w="90"/>
+              <w:bottom w:type="dxa" w:w="50"/>
+              <w:right w:type="dxa" w:w="90"/>
+            </w:tcMar>
+          </w:tcPr>
+          <w:p>
+            <w:pPr>
+              <w:bidi/>
+              <w:jc w:val="center"/>
+            </w:pPr>
+            <w:r>
+              <w:rPr>
+                <w:rFonts w:ascii="David" w:cs="David" w:eastAsia="David" w:hAnsi="David"/>
+                <w:b/>
+                <w:bCs/>
+                <w:color w:val="248A3D"/>
+                <w:sz w:val="18"/>
+                <w:szCs w:val="18"/>
+                <w:rtl/>
+              </w:rPr>
+              <w:t xml:space="preserve">אין</w:t>
+            </w:r>
+          </w:p>
+        </w:tc>
+      </w:tr>
+    </w:tbl>
+    <w:p>
+      <w:pPr>
+        <w:bidi/>
+      </w:pPr>
+    </w:p>
+    <w:p>
+      <w:pPr>
+        <w:bidi/>
+        <w:spacing w:after="120" w:before="60"/>
+        <w:jc w:val="start"/>
+      </w:pPr>
+      <w:r>
+        <w:rPr>
+          <w:rFonts w:ascii="David" w:cs="David" w:eastAsia="David" w:hAnsi="David"/>
+          <w:sz w:val="22"/>
+          <w:szCs w:val="22"/>
+          <w:rtl/>
+        </w:rPr>
+        <w:t xml:space="preserve">השארית הנטו (</w:t>
+      </w:r>
+      <w:r>
+        <w:rPr>
+          <w:rFonts w:ascii="David" w:cs="David" w:eastAsia="David" w:hAnsi="David"/>
+          <w:sz w:val="22"/>
+          <w:szCs w:val="22"/>
+          <w:rtl/>
+        </w:rPr>
+        <w:t xml:space="preserve">‎441,405‎</w:t>
+      </w:r>
+      <w:r>
+        <w:rPr>
+          <w:rFonts w:ascii="David" w:cs="David" w:eastAsia="David" w:hAnsi="David"/>
+          <w:sz w:val="22"/>
+          <w:szCs w:val="22"/>
+          <w:rtl/>
+        </w:rPr>
+        <w:t xml:space="preserve">) שווה בדיוק לרכיב אירופה, ומתפרקת לשקל לפי קטגוריה: על </w:t>
+      </w:r>
+      <w:r>
+        <w:rPr>
+          <w:rFonts w:ascii="David" w:cs="David" w:eastAsia="David" w:hAnsi="David"/>
+          <w:sz w:val="22"/>
+          <w:szCs w:val="22"/>
+          <w:rtl/>
+        </w:rPr>
+        <w:t xml:space="preserve">372,217</w:t>
+      </w:r>
+      <w:r>
+        <w:rPr>
+          <w:rFonts w:ascii="David" w:cs="David" w:eastAsia="David" w:hAnsi="David"/>
+          <w:sz w:val="22"/>
+          <w:szCs w:val="22"/>
+          <w:rtl/>
+        </w:rPr>
+        <w:t xml:space="preserve">  (</w:t>
+      </w:r>
+      <w:r>
+        <w:rPr>
+          <w:rFonts w:ascii="David" w:cs="David" w:eastAsia="David" w:hAnsi="David"/>
+          <w:sz w:val="22"/>
+          <w:szCs w:val="22"/>
+          <w:rtl/>
+        </w:rPr>
+        <w:t xml:space="preserve">‎1%‎</w:t>
+      </w:r>
+      <w:r>
+        <w:rPr>
+          <w:rFonts w:ascii="David" w:cs="David" w:eastAsia="David" w:hAnsi="David"/>
+          <w:sz w:val="22"/>
+          <w:szCs w:val="22"/>
+          <w:rtl/>
+        </w:rPr>
+        <w:t xml:space="preserve">) · קבוצתי </w:t>
+      </w:r>
+      <w:r>
+        <w:rPr>
+          <w:rFonts w:ascii="David" w:cs="David" w:eastAsia="David" w:hAnsi="David"/>
+          <w:sz w:val="22"/>
+          <w:szCs w:val="22"/>
+          <w:rtl/>
+        </w:rPr>
+        <w:t xml:space="preserve">69,188</w:t>
+      </w:r>
+      <w:r>
+        <w:rPr>
+          <w:rFonts w:ascii="David" w:cs="David" w:eastAsia="David" w:hAnsi="David"/>
+          <w:sz w:val="22"/>
+          <w:szCs w:val="22"/>
+          <w:rtl/>
+        </w:rPr>
+        <w:t xml:space="preserve">  (</w:t>
+      </w:r>
+      <w:r>
+        <w:rPr>
+          <w:rFonts w:ascii="David" w:cs="David" w:eastAsia="David" w:hAnsi="David"/>
+          <w:sz w:val="22"/>
+          <w:szCs w:val="22"/>
+          <w:rtl/>
+        </w:rPr>
+        <w:t xml:space="preserve">‎2%‎</w:t>
+      </w:r>
+      <w:r>
+        <w:rPr>
+          <w:rFonts w:ascii="David" w:cs="David" w:eastAsia="David" w:hAnsi="David"/>
+          <w:sz w:val="22"/>
+          <w:szCs w:val="22"/>
+          <w:rtl/>
+        </w:rPr>
+        <w:t xml:space="preserve">), אישי </w:t>
+      </w:r>
+      <w:r>
+        <w:rPr>
+          <w:rFonts w:ascii="David" w:cs="David" w:eastAsia="David" w:hAnsi="David"/>
+          <w:sz w:val="22"/>
+          <w:szCs w:val="22"/>
+          <w:rtl/>
+        </w:rPr>
+        <w:t xml:space="preserve">‎0‎</w:t>
+      </w:r>
+      <w:r>
+        <w:rPr>
+          <w:rFonts w:ascii="David" w:cs="David" w:eastAsia="David" w:hAnsi="David"/>
+          <w:sz w:val="22"/>
+          <w:szCs w:val="22"/>
+          <w:rtl/>
+        </w:rPr>
+        <w:t xml:space="preserve">, לא-אולימפי </w:t>
+      </w:r>
+      <w:r>
+        <w:rPr>
+          <w:rFonts w:ascii="David" w:cs="David" w:eastAsia="David" w:hAnsi="David"/>
+          <w:sz w:val="22"/>
+          <w:szCs w:val="22"/>
+          <w:rtl/>
+        </w:rPr>
+        <w:t xml:space="preserve">‎0‎</w:t>
+      </w:r>
+      <w:r>
+        <w:rPr>
+          <w:rFonts w:ascii="David" w:cs="David" w:eastAsia="David" w:hAnsi="David"/>
+          <w:sz w:val="22"/>
+          <w:szCs w:val="22"/>
+          <w:rtl/>
+        </w:rPr>
+        <w:t xml:space="preserve">. הפיזור הפר-איגודי (התעמלות </w:t>
+      </w:r>
+      <w:r>
+        <w:rPr>
+          <w:rFonts w:ascii="David" w:cs="David" w:eastAsia="David" w:hAnsi="David"/>
+          <w:sz w:val="22"/>
+          <w:szCs w:val="22"/>
+          <w:rtl/>
+        </w:rPr>
+        <w:t xml:space="preserve">793K</w:t>
+      </w:r>
+      <w:r>
+        <w:rPr>
+          <w:rFonts w:ascii="David" w:cs="David" w:eastAsia="David" w:hAnsi="David"/>
+          <w:sz w:val="22"/>
+          <w:szCs w:val="22"/>
+          <w:rtl/>
+        </w:rPr>
+        <w:t xml:space="preserve"> על חשבון ג׳ודו </w:t>
+      </w:r>
+      <w:r>
+        <w:rPr>
+          <w:rFonts w:ascii="David" w:cs="David" w:eastAsia="David" w:hAnsi="David"/>
+          <w:sz w:val="22"/>
+          <w:szCs w:val="22"/>
+          <w:rtl/>
+        </w:rPr>
+        <w:t xml:space="preserve">437K</w:t>
+      </w:r>
+      <w:r>
+        <w:rPr>
+          <w:rFonts w:ascii="David" w:cs="David" w:eastAsia="David" w:hAnsi="David"/>
+          <w:sz w:val="22"/>
+          <w:szCs w:val="22"/>
+          <w:rtl/>
+        </w:rPr>
+        <w:t xml:space="preserve">) מתאזן לאפס בתוך כל קטגוריה — זו תקרת ההגנה (סכום-אפס), לא רעש.</w:t>
+      </w:r>
+    </w:p>
+    <w:p>
+      <w:pPr>
+        <w:pStyle w:val="Heading1"/>
+        <w:bidi/>
+        <w:spacing w:after="130" w:before="300"/>
+        <w:jc w:val="start"/>
+      </w:pPr>
+      <w:r>
+        <w:rPr>
+          <w:rFonts w:ascii="David" w:cs="David" w:eastAsia="David" w:hAnsi="David"/>
+          <w:b/>
+          <w:bCs/>
+          <w:color w:val="1F3F6D"/>
+          <w:sz w:val="25"/>
+          <w:szCs w:val="25"/>
+          <w:rtl/>
+        </w:rPr>
+        <w:t xml:space="preserve">ערכי R_c — ש״ח לנקודה לכל אמת מידה</w:t>
+      </w:r>
+    </w:p>
+    <w:tbl>
+      <w:tblPr>
+        <w:bidiVisual/>
+        <w:tblW w:type="dxa" w:w="7800"/>
+        <w:tblBorders>
+          <w:top w:val="single" w:color="auto" w:sz="4"/>
+          <w:left w:val="single" w:color="auto" w:sz="4"/>
+          <w:bottom w:val="single" w:color="auto" w:sz="4"/>
+          <w:right w:val="single" w:color="auto" w:sz="4"/>
+          <w:insideH w:val="single" w:color="auto" w:sz="4"/>
+          <w:insideV w:val="single" w:color="auto" w:sz="4"/>
+        </w:tblBorders>
+      </w:tblPr>
+      <w:tblGrid>
+        <w:gridCol w:w="2400"/>
+        <w:gridCol w:w="1800"/>
+        <w:gridCol w:w="1800"/>
+        <w:gridCol w:w="1800"/>
+      </w:tblGrid>
+      <w:tr>
+        <w:trPr>
+          <w:tblHeader/>
+        </w:trPr>
+        <w:tc>
+          <w:tcPr>
+            <w:tcW w:type="dxa" w:w="2400"/>
+            <w:tcBorders>
+              <w:top w:val="single" w:color="C7D0DD" w:sz="4"/>
+              <w:left w:val="single" w:color="C7D0DD" w:sz="4"/>
+              <w:bottom w:val="single" w:color="C7D0DD" w:sz="4"/>
+              <w:right w:val="single" w:color="C7D0DD" w:sz="4"/>
+            </w:tcBorders>
+            <w:shd w:fill="1F3F6D" w:val="clear"/>
+            <w:tcMar>
+              <w:top w:type="dxa" w:w="50"/>
+              <w:left w:type="dxa" w:w="90"/>
+              <w:bottom w:type="dxa" w:w="50"/>
+              <w:right w:type="dxa" w:w="90"/>
+            </w:tcMar>
+          </w:tcPr>
+          <w:p>
+            <w:pPr>
+              <w:bidi/>
+              <w:jc w:val="center"/>
+            </w:pPr>
+            <w:r>
+              <w:rPr>
+                <w:rFonts w:ascii="David" w:cs="David" w:eastAsia="David" w:hAnsi="David"/>
+                <w:b/>
+                <w:bCs/>
+                <w:color w:val="FFFFFF"/>
+                <w:sz w:val="18"/>
+                <w:szCs w:val="18"/>
+                <w:rtl/>
+              </w:rPr>
+              <w:t xml:space="preserve">אמת מידה</w:t>
+            </w:r>
+          </w:p>
+        </w:tc>
+        <w:tc>
+          <w:tcPr>
+            <w:tcW w:type="dxa" w:w="1800"/>
+            <w:tcBorders>
+              <w:top w:val="single" w:color="C7D0DD" w:sz="4"/>
+              <w:left w:val="single" w:color="C7D0DD" w:sz="4"/>
+              <w:bottom w:val="single" w:color="C7D0DD" w:sz="4"/>
+              <w:right w:val="single" w:color="C7D0DD" w:sz="4"/>
+            </w:tcBorders>
+            <w:shd w:fill="1F3F6D" w:val="clear"/>
+            <w:tcMar>
+              <w:top w:type="dxa" w:w="50"/>
+              <w:left w:type="dxa" w:w="90"/>
+              <w:bottom w:type="dxa" w:w="50"/>
+              <w:right w:type="dxa" w:w="90"/>
+            </w:tcMar>
+          </w:tcPr>
+          <w:p>
+            <w:pPr>
+              <w:bidi/>
+              <w:jc w:val="center"/>
+            </w:pPr>
+            <w:r>
+              <w:rPr>
+                <w:rFonts w:ascii="David" w:cs="David" w:eastAsia="David" w:hAnsi="David"/>
+                <w:b/>
+                <w:bCs/>
+                <w:color w:val="FFFFFF"/>
+                <w:sz w:val="18"/>
+                <w:szCs w:val="18"/>
+                <w:rtl/>
+              </w:rPr>
+              <w:t xml:space="preserve">על</w:t>
+            </w:r>
+          </w:p>
+        </w:tc>
+        <w:tc>
+          <w:tcPr>
+            <w:tcW w:type="dxa" w:w="1800"/>
+            <w:tcBorders>
+              <w:top w:val="single" w:color="C7D0DD" w:sz="4"/>
+              <w:left w:val="single" w:color="C7D0DD" w:sz="4"/>
+              <w:bottom w:val="single" w:color="C7D0DD" w:sz="4"/>
+              <w:right w:val="single" w:color="C7D0DD" w:sz="4"/>
+            </w:tcBorders>
+            <w:shd w:fill="1F3F6D" w:val="clear"/>
+            <w:tcMar>
+              <w:top w:type="dxa" w:w="50"/>
+              <w:left w:type="dxa" w:w="90"/>
+              <w:bottom w:type="dxa" w:w="50"/>
+              <w:right w:type="dxa" w:w="90"/>
+            </w:tcMar>
+          </w:tcPr>
+          <w:p>
+            <w:pPr>
+              <w:bidi/>
+              <w:jc w:val="center"/>
+            </w:pPr>
+            <w:r>
+              <w:rPr>
+                <w:rFonts w:ascii="David" w:cs="David" w:eastAsia="David" w:hAnsi="David"/>
+                <w:b/>
+                <w:bCs/>
+                <w:color w:val="FFFFFF"/>
+                <w:sz w:val="18"/>
+                <w:szCs w:val="18"/>
+                <w:rtl/>
+              </w:rPr>
+              <w:t xml:space="preserve">קבוצתי</w:t>
+            </w:r>
+          </w:p>
+        </w:tc>
+        <w:tc>
+          <w:tcPr>
+            <w:tcW w:type="dxa" w:w="1800"/>
+            <w:tcBorders>
+              <w:top w:val="single" w:color="C7D0DD" w:sz="4"/>
+              <w:left w:val="single" w:color="C7D0DD" w:sz="4"/>
+              <w:bottom w:val="single" w:color="C7D0DD" w:sz="4"/>
+              <w:right w:val="single" w:color="C7D0DD" w:sz="4"/>
+            </w:tcBorders>
+            <w:shd w:fill="1F3F6D" w:val="clear"/>
+            <w:tcMar>
+              <w:top w:type="dxa" w:w="50"/>
+              <w:left w:type="dxa" w:w="90"/>
+              <w:bottom w:type="dxa" w:w="50"/>
+              <w:right w:type="dxa" w:w="90"/>
+            </w:tcMar>
+          </w:tcPr>
+          <w:p>
+            <w:pPr>
+              <w:bidi/>
+              <w:jc w:val="center"/>
+            </w:pPr>
+            <w:r>
+              <w:rPr>
+                <w:rFonts w:ascii="David" w:cs="David" w:eastAsia="David" w:hAnsi="David"/>
+                <w:b/>
+                <w:bCs/>
+                <w:color w:val="FFFFFF"/>
+                <w:sz w:val="18"/>
+                <w:szCs w:val="18"/>
+                <w:rtl/>
+              </w:rPr>
+              <w:t xml:space="preserve">אישי</w:t>
+            </w:r>
+          </w:p>
+        </w:tc>
+      </w:tr>
+      <w:tr>
+        <w:tc>
+          <w:tcPr>
+            <w:tcW w:type="dxa" w:w="2400"/>
+            <w:tcBorders>
+              <w:top w:val="single" w:color="C7D0DD" w:sz="4"/>
+              <w:left w:val="single" w:color="C7D0DD" w:sz="4"/>
+              <w:bottom w:val="single" w:color="C7D0DD" w:sz="4"/>
+              <w:right w:val="single" w:color="C7D0DD" w:sz="4"/>
+            </w:tcBorders>
+            <w:shd w:fill="FFFFFF" w:val="clear"/>
+            <w:tcMar>
+              <w:top w:type="dxa" w:w="50"/>
+              <w:left w:type="dxa" w:w="90"/>
+              <w:bottom w:type="dxa" w:w="50"/>
+              <w:right w:type="dxa" w:w="90"/>
+            </w:tcMar>
+          </w:tcPr>
+          <w:p>
+            <w:pPr>
+              <w:bidi/>
+              <w:jc w:val="center"/>
+            </w:pPr>
+            <w:r>
+              <w:rPr>
+                <w:rFonts w:ascii="David" w:cs="David" w:eastAsia="David" w:hAnsi="David"/>
+                <w:color w:val="1A1A2E"/>
+                <w:sz w:val="18"/>
+                <w:szCs w:val="18"/>
+                <w:rtl/>
+              </w:rPr>
+              <w:t xml:space="preserve">ספורטאים</w:t>
+            </w:r>
+          </w:p>
+        </w:tc>
+        <w:tc>
+          <w:tcPr>
+            <w:tcW w:type="dxa" w:w="1800"/>
+            <w:tcBorders>
+              <w:top w:val="single" w:color="C7D0DD" w:sz="4"/>
+              <w:left w:val="single" w:color="C7D0DD" w:sz="4"/>
+              <w:bottom w:val="single" w:color="C7D0DD" w:sz="4"/>
+              <w:right w:val="single" w:color="C7D0DD" w:sz="4"/>
+            </w:tcBorders>
+            <w:shd w:fill="FFFFFF" w:val="clear"/>
+            <w:tcMar>
+              <w:top w:type="dxa" w:w="50"/>
+              <w:left w:type="dxa" w:w="90"/>
+              <w:bottom w:type="dxa" w:w="50"/>
+              <w:right w:type="dxa" w:w="90"/>
+            </w:tcMar>
+          </w:tcPr>
+          <w:p>
+            <w:pPr>
+              <w:bidi/>
+              <w:jc w:val="center"/>
+            </w:pPr>
+            <w:r>
+              <w:rPr>
+                <w:rFonts w:ascii="David" w:cs="David" w:eastAsia="David" w:hAnsi="David"/>
+                <w:color w:val="1A1A2E"/>
+                <w:sz w:val="18"/>
+                <w:szCs w:val="18"/>
+                <w:rtl/>
+              </w:rPr>
+              <w:t xml:space="preserve">‎53.7‎</w:t>
+            </w:r>
+          </w:p>
+        </w:tc>
+        <w:tc>
+          <w:tcPr>
+            <w:tcW w:type="dxa" w:w="1800"/>
+            <w:tcBorders>
+              <w:top w:val="single" w:color="C7D0DD" w:sz="4"/>
+              <w:left w:val="single" w:color="C7D0DD" w:sz="4"/>
+              <w:bottom w:val="single" w:color="C7D0DD" w:sz="4"/>
+              <w:right w:val="single" w:color="C7D0DD" w:sz="4"/>
+            </w:tcBorders>
+            <w:shd w:fill="FFFFFF" w:val="clear"/>
+            <w:tcMar>
+              <w:top w:type="dxa" w:w="50"/>
+              <w:left w:type="dxa" w:w="90"/>
+              <w:bottom w:type="dxa" w:w="50"/>
+              <w:right w:type="dxa" w:w="90"/>
+            </w:tcMar>
+          </w:tcPr>
+          <w:p>
+            <w:pPr>
+              <w:bidi/>
+              <w:jc w:val="center"/>
+            </w:pPr>
+            <w:r>
+              <w:rPr>
+                <w:rFonts w:ascii="David" w:cs="David" w:eastAsia="David" w:hAnsi="David"/>
+                <w:color w:val="1A1A2E"/>
+                <w:sz w:val="18"/>
+                <w:szCs w:val="18"/>
+                <w:rtl/>
+              </w:rPr>
+              <w:t xml:space="preserve">‎94.6‎</w:t>
+            </w:r>
+          </w:p>
+        </w:tc>
+        <w:tc>
+          <w:tcPr>
+            <w:tcW w:type="dxa" w:w="1800"/>
+            <w:tcBorders>
+              <w:top w:val="single" w:color="C7D0DD" w:sz="4"/>
+              <w:left w:val="single" w:color="C7D0DD" w:sz="4"/>
+              <w:bottom w:val="single" w:color="C7D0DD" w:sz="4"/>
+              <w:right w:val="single" w:color="C7D0DD" w:sz="4"/>
+            </w:tcBorders>
+            <w:shd w:fill="FFFFFF" w:val="clear"/>
+            <w:tcMar>
+              <w:top w:type="dxa" w:w="50"/>
+              <w:left w:type="dxa" w:w="90"/>
+              <w:bottom w:type="dxa" w:w="50"/>
+              <w:right w:type="dxa" w:w="90"/>
+            </w:tcMar>
+          </w:tcPr>
+          <w:p>
+            <w:pPr>
+              <w:bidi/>
+              <w:jc w:val="center"/>
+            </w:pPr>
+            <w:r>
+              <w:rPr>
+                <w:rFonts w:ascii="David" w:cs="David" w:eastAsia="David" w:hAnsi="David"/>
+                <w:color w:val="1A1A2E"/>
+                <w:sz w:val="18"/>
+                <w:szCs w:val="18"/>
+                <w:rtl/>
+              </w:rPr>
+              <w:t xml:space="preserve">‎94.6‎</w:t>
+            </w:r>
+          </w:p>
+        </w:tc>
+      </w:tr>
+      <w:tr>
+        <w:tc>
+          <w:tcPr>
+            <w:tcW w:type="dxa" w:w="2400"/>
+            <w:tcBorders>
+              <w:top w:val="single" w:color="C7D0DD" w:sz="4"/>
+              <w:left w:val="single" w:color="C7D0DD" w:sz="4"/>
+              <w:bottom w:val="single" w:color="C7D0DD" w:sz="4"/>
+              <w:right w:val="single" w:color="C7D0DD" w:sz="4"/>
+            </w:tcBorders>
+            <w:shd w:fill="FFFFFF" w:val="clear"/>
+            <w:tcMar>
+              <w:top w:type="dxa" w:w="50"/>
+              <w:left w:type="dxa" w:w="90"/>
+              <w:bottom w:type="dxa" w:w="50"/>
+              <w:right w:type="dxa" w:w="90"/>
+            </w:tcMar>
+          </w:tcPr>
+          <w:p>
+            <w:pPr>
+              <w:bidi/>
+              <w:jc w:val="center"/>
+            </w:pPr>
+            <w:r>
+              <w:rPr>
+                <w:rFonts w:ascii="David" w:cs="David" w:eastAsia="David" w:hAnsi="David"/>
+                <w:color w:val="1A1A2E"/>
+                <w:sz w:val="18"/>
+                <w:szCs w:val="18"/>
+                <w:rtl/>
+              </w:rPr>
+              <w:t xml:space="preserve">הישגיות</w:t>
+            </w:r>
+          </w:p>
+        </w:tc>
+        <w:tc>
+          <w:tcPr>
+            <w:tcW w:type="dxa" w:w="1800"/>
+            <w:tcBorders>
+              <w:top w:val="single" w:color="C7D0DD" w:sz="4"/>
+              <w:left w:val="single" w:color="C7D0DD" w:sz="4"/>
+              <w:bottom w:val="single" w:color="C7D0DD" w:sz="4"/>
+              <w:right w:val="single" w:color="C7D0DD" w:sz="4"/>
+            </w:tcBorders>
+            <w:shd w:fill="FFFFFF" w:val="clear"/>
+            <w:tcMar>
+              <w:top w:type="dxa" w:w="50"/>
+              <w:left w:type="dxa" w:w="90"/>
+              <w:bottom w:type="dxa" w:w="50"/>
+              <w:right w:type="dxa" w:w="90"/>
+            </w:tcMar>
+          </w:tcPr>
+          <w:p>
+            <w:pPr>
+              <w:bidi/>
+              <w:jc w:val="center"/>
+            </w:pPr>
+            <w:r>
+              <w:rPr>
+                <w:rFonts w:ascii="David" w:cs="David" w:eastAsia="David" w:hAnsi="David"/>
+                <w:color w:val="1A1A2E"/>
+                <w:sz w:val="18"/>
+                <w:szCs w:val="18"/>
+                <w:rtl/>
+              </w:rPr>
+              <w:t xml:space="preserve">‎4,202.9‎</w:t>
+            </w:r>
+          </w:p>
+        </w:tc>
+        <w:tc>
+          <w:tcPr>
+            <w:tcW w:type="dxa" w:w="1800"/>
+            <w:tcBorders>
+              <w:top w:val="single" w:color="C7D0DD" w:sz="4"/>
+              <w:left w:val="single" w:color="C7D0DD" w:sz="4"/>
+              <w:bottom w:val="single" w:color="C7D0DD" w:sz="4"/>
+              <w:right w:val="single" w:color="C7D0DD" w:sz="4"/>
+            </w:tcBorders>
+            <w:shd w:fill="FFFFFF" w:val="clear"/>
+            <w:tcMar>
+              <w:top w:type="dxa" w:w="50"/>
+              <w:left w:type="dxa" w:w="90"/>
+              <w:bottom w:type="dxa" w:w="50"/>
+              <w:right w:type="dxa" w:w="90"/>
+            </w:tcMar>
+          </w:tcPr>
+          <w:p>
+            <w:pPr>
+              <w:bidi/>
+              <w:jc w:val="center"/>
+            </w:pPr>
+            <w:r>
+              <w:rPr>
+                <w:rFonts w:ascii="David" w:cs="David" w:eastAsia="David" w:hAnsi="David"/>
+                <w:color w:val="1A1A2E"/>
+                <w:sz w:val="18"/>
+                <w:szCs w:val="18"/>
+                <w:rtl/>
+              </w:rPr>
+              <w:t xml:space="preserve">‎569.4‎</w:t>
+            </w:r>
+          </w:p>
+        </w:tc>
+        <w:tc>
+          <w:tcPr>
+            <w:tcW w:type="dxa" w:w="1800"/>
+            <w:tcBorders>
+              <w:top w:val="single" w:color="C7D0DD" w:sz="4"/>
+              <w:left w:val="single" w:color="C7D0DD" w:sz="4"/>
+              <w:bottom w:val="single" w:color="C7D0DD" w:sz="4"/>
+              <w:right w:val="single" w:color="C7D0DD" w:sz="4"/>
+            </w:tcBorders>
+            <w:shd w:fill="FFFFFF" w:val="clear"/>
+            <w:tcMar>
+              <w:top w:type="dxa" w:w="50"/>
+              <w:left w:type="dxa" w:w="90"/>
+              <w:bottom w:type="dxa" w:w="50"/>
+              <w:right w:type="dxa" w:w="90"/>
+            </w:tcMar>
+          </w:tcPr>
+          <w:p>
+            <w:pPr>
+              <w:bidi/>
+              <w:jc w:val="center"/>
+            </w:pPr>
+            <w:r>
+              <w:rPr>
+                <w:rFonts w:ascii="David" w:cs="David" w:eastAsia="David" w:hAnsi="David"/>
+                <w:color w:val="1A1A2E"/>
+                <w:sz w:val="18"/>
+                <w:szCs w:val="18"/>
+                <w:rtl/>
+              </w:rPr>
+              <w:t xml:space="preserve">‎3,721.2‎</w:t>
+            </w:r>
+          </w:p>
+        </w:tc>
+      </w:tr>
+      <w:tr>
+        <w:tc>
+          <w:tcPr>
+            <w:tcW w:type="dxa" w:w="2400"/>
+            <w:tcBorders>
+              <w:top w:val="single" w:color="C7D0DD" w:sz="4"/>
+              <w:left w:val="single" w:color="C7D0DD" w:sz="4"/>
+              <w:bottom w:val="single" w:color="C7D0DD" w:sz="4"/>
+              <w:right w:val="single" w:color="C7D0DD" w:sz="4"/>
+            </w:tcBorders>
+            <w:shd w:fill="FFFFFF" w:val="clear"/>
+            <w:tcMar>
+              <w:top w:type="dxa" w:w="50"/>
+              <w:left w:type="dxa" w:w="90"/>
+              <w:bottom w:type="dxa" w:w="50"/>
+              <w:right w:type="dxa" w:w="90"/>
+            </w:tcMar>
+          </w:tcPr>
+          <w:p>
+            <w:pPr>
+              <w:bidi/>
+              <w:jc w:val="center"/>
+            </w:pPr>
+            <w:r>
+              <w:rPr>
+                <w:rFonts w:ascii="David" w:cs="David" w:eastAsia="David" w:hAnsi="David"/>
+                <w:color w:val="1A1A2E"/>
+                <w:sz w:val="18"/>
+                <w:szCs w:val="18"/>
+                <w:rtl/>
+              </w:rPr>
+              <w:t xml:space="preserve">מקצועיות</w:t>
+            </w:r>
+          </w:p>
+        </w:tc>
+        <w:tc>
+          <w:tcPr>
+            <w:tcW w:type="dxa" w:w="1800"/>
+            <w:tcBorders>
+              <w:top w:val="single" w:color="C7D0DD" w:sz="4"/>
+              <w:left w:val="single" w:color="C7D0DD" w:sz="4"/>
+              <w:bottom w:val="single" w:color="C7D0DD" w:sz="4"/>
+              <w:right w:val="single" w:color="C7D0DD" w:sz="4"/>
+            </w:tcBorders>
+            <w:shd w:fill="FFFFFF" w:val="clear"/>
+            <w:tcMar>
+              <w:top w:type="dxa" w:w="50"/>
+              <w:left w:type="dxa" w:w="90"/>
+              <w:bottom w:type="dxa" w:w="50"/>
+              <w:right w:type="dxa" w:w="90"/>
+            </w:tcMar>
+          </w:tcPr>
+          <w:p>
+            <w:pPr>
+              <w:bidi/>
+              <w:jc w:val="center"/>
+            </w:pPr>
+            <w:r>
+              <w:rPr>
+                <w:rFonts w:ascii="David" w:cs="David" w:eastAsia="David" w:hAnsi="David"/>
+                <w:color w:val="1A1A2E"/>
+                <w:sz w:val="18"/>
+                <w:szCs w:val="18"/>
+                <w:rtl/>
+              </w:rPr>
+              <w:t xml:space="preserve">‎38,176‎</w:t>
+            </w:r>
+          </w:p>
+        </w:tc>
+        <w:tc>
+          <w:tcPr>
+            <w:tcW w:type="dxa" w:w="1800"/>
+            <w:tcBorders>
+              <w:top w:val="single" w:color="C7D0DD" w:sz="4"/>
+              <w:left w:val="single" w:color="C7D0DD" w:sz="4"/>
+              <w:bottom w:val="single" w:color="C7D0DD" w:sz="4"/>
+              <w:right w:val="single" w:color="C7D0DD" w:sz="4"/>
+            </w:tcBorders>
+            <w:shd w:fill="FFFFFF" w:val="clear"/>
+            <w:tcMar>
+              <w:top w:type="dxa" w:w="50"/>
+              <w:left w:type="dxa" w:w="90"/>
+              <w:bottom w:type="dxa" w:w="50"/>
+              <w:right w:type="dxa" w:w="90"/>
+            </w:tcMar>
+          </w:tcPr>
+          <w:p>
+            <w:pPr>
+              <w:bidi/>
+              <w:jc w:val="center"/>
+            </w:pPr>
+            <w:r>
+              <w:rPr>
+                <w:rFonts w:ascii="David" w:cs="David" w:eastAsia="David" w:hAnsi="David"/>
+                <w:color w:val="1A1A2E"/>
+                <w:sz w:val="18"/>
+                <w:szCs w:val="18"/>
+                <w:rtl/>
+              </w:rPr>
+              <w:t xml:space="preserve">‎16,672‎</w:t>
+            </w:r>
+          </w:p>
+        </w:tc>
+        <w:tc>
+          <w:tcPr>
+            <w:tcW w:type="dxa" w:w="1800"/>
+            <w:tcBorders>
+              <w:top w:val="single" w:color="C7D0DD" w:sz="4"/>
+              <w:left w:val="single" w:color="C7D0DD" w:sz="4"/>
+              <w:bottom w:val="single" w:color="C7D0DD" w:sz="4"/>
+              <w:right w:val="single" w:color="C7D0DD" w:sz="4"/>
+            </w:tcBorders>
+            <w:shd w:fill="FFFFFF" w:val="clear"/>
+            <w:tcMar>
+              <w:top w:type="dxa" w:w="50"/>
+              <w:left w:type="dxa" w:w="90"/>
+              <w:bottom w:type="dxa" w:w="50"/>
+              <w:right w:type="dxa" w:w="90"/>
+            </w:tcMar>
+          </w:tcPr>
+          <w:p>
+            <w:pPr>
+              <w:bidi/>
+              <w:jc w:val="center"/>
+            </w:pPr>
+            <w:r>
+              <w:rPr>
+                <w:rFonts w:ascii="David" w:cs="David" w:eastAsia="David" w:hAnsi="David"/>
+                <w:color w:val="1A1A2E"/>
+                <w:sz w:val="18"/>
+                <w:szCs w:val="18"/>
+                <w:rtl/>
+              </w:rPr>
+              <w:t xml:space="preserve">‎15,095‎</w:t>
+            </w:r>
+          </w:p>
+        </w:tc>
+      </w:tr>
+      <w:tr>
+        <w:tc>
+          <w:tcPr>
+            <w:tcW w:type="dxa" w:w="2400"/>
+            <w:tcBorders>
+              <w:top w:val="single" w:color="C7D0DD" w:sz="4"/>
+              <w:left w:val="single" w:color="C7D0DD" w:sz="4"/>
+              <w:bottom w:val="single" w:color="C7D0DD" w:sz="4"/>
+              <w:right w:val="single" w:color="C7D0DD" w:sz="4"/>
+            </w:tcBorders>
+            <w:shd w:fill="FFFFFF" w:val="clear"/>
+            <w:tcMar>
+              <w:top w:type="dxa" w:w="50"/>
+              <w:left w:type="dxa" w:w="90"/>
+              <w:bottom w:type="dxa" w:w="50"/>
+              <w:right w:type="dxa" w:w="90"/>
+            </w:tcMar>
+          </w:tcPr>
+          <w:p>
+            <w:pPr>
+              <w:bidi/>
+              <w:jc w:val="center"/>
+            </w:pPr>
+            <w:r>
+              <w:rPr>
+                <w:rFonts w:ascii="David" w:cs="David" w:eastAsia="David" w:hAnsi="David"/>
+                <w:color w:val="1A1A2E"/>
+                <w:sz w:val="18"/>
+                <w:szCs w:val="18"/>
+                <w:rtl/>
+              </w:rPr>
+              <w:t xml:space="preserve">ליווי מאמנים</w:t>
+            </w:r>
+          </w:p>
+        </w:tc>
+        <w:tc>
+          <w:tcPr>
+            <w:tcW w:type="dxa" w:w="1800"/>
+            <w:tcBorders>
+              <w:top w:val="single" w:color="C7D0DD" w:sz="4"/>
+              <w:left w:val="single" w:color="C7D0DD" w:sz="4"/>
+              <w:bottom w:val="single" w:color="C7D0DD" w:sz="4"/>
+              <w:right w:val="single" w:color="C7D0DD" w:sz="4"/>
+            </w:tcBorders>
+            <w:shd w:fill="FFFFFF" w:val="clear"/>
+            <w:tcMar>
+              <w:top w:type="dxa" w:w="50"/>
+              <w:left w:type="dxa" w:w="90"/>
+              <w:bottom w:type="dxa" w:w="50"/>
+              <w:right w:type="dxa" w:w="90"/>
+            </w:tcMar>
+          </w:tcPr>
+          <w:p>
+            <w:pPr>
+              <w:bidi/>
+              <w:jc w:val="center"/>
+            </w:pPr>
+            <w:r>
+              <w:rPr>
+                <w:rFonts w:ascii="David" w:cs="David" w:eastAsia="David" w:hAnsi="David"/>
+                <w:color w:val="1A1A2E"/>
+                <w:sz w:val="18"/>
+                <w:szCs w:val="18"/>
+                <w:rtl/>
+              </w:rPr>
+              <w:t xml:space="preserve">‎342.7‎</w:t>
+            </w:r>
+          </w:p>
+        </w:tc>
+        <w:tc>
+          <w:tcPr>
+            <w:tcW w:type="dxa" w:w="1800"/>
+            <w:tcBorders>
+              <w:top w:val="single" w:color="C7D0DD" w:sz="4"/>
+              <w:left w:val="single" w:color="C7D0DD" w:sz="4"/>
+              <w:bottom w:val="single" w:color="C7D0DD" w:sz="4"/>
+              <w:right w:val="single" w:color="C7D0DD" w:sz="4"/>
+            </w:tcBorders>
+            <w:shd w:fill="FFFFFF" w:val="clear"/>
+            <w:tcMar>
+              <w:top w:type="dxa" w:w="50"/>
+              <w:left w:type="dxa" w:w="90"/>
+              <w:bottom w:type="dxa" w:w="50"/>
+              <w:right w:type="dxa" w:w="90"/>
+            </w:tcMar>
+          </w:tcPr>
+          <w:p>
+            <w:pPr>
+              <w:bidi/>
+              <w:jc w:val="center"/>
+            </w:pPr>
+            <w:r>
+              <w:rPr>
+                <w:rFonts w:ascii="David" w:cs="David" w:eastAsia="David" w:hAnsi="David"/>
+                <w:color w:val="1A1A2E"/>
+                <w:sz w:val="18"/>
+                <w:szCs w:val="18"/>
+                <w:rtl/>
+              </w:rPr>
+              <w:t xml:space="preserve">‎520.1‎</w:t>
+            </w:r>
+          </w:p>
+        </w:tc>
+        <w:tc>
+          <w:tcPr>
+            <w:tcW w:type="dxa" w:w="1800"/>
+            <w:tcBorders>
+              <w:top w:val="single" w:color="C7D0DD" w:sz="4"/>
+              <w:left w:val="single" w:color="C7D0DD" w:sz="4"/>
+              <w:bottom w:val="single" w:color="C7D0DD" w:sz="4"/>
+              <w:right w:val="single" w:color="C7D0DD" w:sz="4"/>
+            </w:tcBorders>
+            <w:shd w:fill="FFFFFF" w:val="clear"/>
+            <w:tcMar>
+              <w:top w:type="dxa" w:w="50"/>
+              <w:left w:type="dxa" w:w="90"/>
+              <w:bottom w:type="dxa" w:w="50"/>
+              <w:right w:type="dxa" w:w="90"/>
+            </w:tcMar>
+          </w:tcPr>
+          <w:p>
+            <w:pPr>
+              <w:bidi/>
+              <w:jc w:val="center"/>
+            </w:pPr>
+            <w:r>
+              <w:rPr>
+                <w:rFonts w:ascii="David" w:cs="David" w:eastAsia="David" w:hAnsi="David"/>
+                <w:color w:val="1A1A2E"/>
+                <w:sz w:val="18"/>
+                <w:szCs w:val="18"/>
+                <w:rtl/>
+              </w:rPr>
+              <w:t xml:space="preserve">‎429.9‎</w:t>
+            </w:r>
+          </w:p>
+        </w:tc>
+      </w:tr>
+      <w:tr>
+        <w:tc>
+          <w:tcPr>
+            <w:tcW w:type="dxa" w:w="2400"/>
+            <w:tcBorders>
+              <w:top w:val="single" w:color="C7D0DD" w:sz="4"/>
+              <w:left w:val="single" w:color="C7D0DD" w:sz="4"/>
+              <w:bottom w:val="single" w:color="C7D0DD" w:sz="4"/>
+              <w:right w:val="single" w:color="C7D0DD" w:sz="4"/>
+            </w:tcBorders>
+            <w:shd w:fill="FFFFFF" w:val="clear"/>
+            <w:tcMar>
+              <w:top w:type="dxa" w:w="50"/>
+              <w:left w:type="dxa" w:w="90"/>
+              <w:bottom w:type="dxa" w:w="50"/>
+              <w:right w:type="dxa" w:w="90"/>
+            </w:tcMar>
+          </w:tcPr>
+          <w:p>
+            <w:pPr>
+              <w:bidi/>
+              <w:jc w:val="center"/>
+            </w:pPr>
+            <w:r>
+              <w:rPr>
+                <w:rFonts w:ascii="David" w:cs="David" w:eastAsia="David" w:hAnsi="David"/>
+                <w:color w:val="1A1A2E"/>
+                <w:sz w:val="18"/>
+                <w:szCs w:val="18"/>
+                <w:rtl/>
+              </w:rPr>
+              <w:t xml:space="preserve">עלות ענף</w:t>
+            </w:r>
+          </w:p>
+        </w:tc>
+        <w:tc>
+          <w:tcPr>
+            <w:tcW w:type="dxa" w:w="1800"/>
+            <w:tcBorders>
+              <w:top w:val="single" w:color="C7D0DD" w:sz="4"/>
+              <w:left w:val="single" w:color="C7D0DD" w:sz="4"/>
+              <w:bottom w:val="single" w:color="C7D0DD" w:sz="4"/>
+              <w:right w:val="single" w:color="C7D0DD" w:sz="4"/>
+            </w:tcBorders>
+            <w:shd w:fill="FFFFFF" w:val="clear"/>
+            <w:tcMar>
+              <w:top w:type="dxa" w:w="50"/>
+              <w:left w:type="dxa" w:w="90"/>
+              <w:bottom w:type="dxa" w:w="50"/>
+              <w:right w:type="dxa" w:w="90"/>
+            </w:tcMar>
+          </w:tcPr>
+          <w:p>
+            <w:pPr>
+              <w:bidi/>
+              <w:jc w:val="center"/>
+            </w:pPr>
+            <w:r>
+              <w:rPr>
+                <w:rFonts w:ascii="David" w:cs="David" w:eastAsia="David" w:hAnsi="David"/>
+                <w:color w:val="1A1A2E"/>
+                <w:sz w:val="18"/>
+                <w:szCs w:val="18"/>
+                <w:rtl/>
+              </w:rPr>
+              <w:t xml:space="preserve">‎112,793‎</w:t>
+            </w:r>
+          </w:p>
+        </w:tc>
+        <w:tc>
+          <w:tcPr>
+            <w:tcW w:type="dxa" w:w="1800"/>
+            <w:tcBorders>
+              <w:top w:val="single" w:color="C7D0DD" w:sz="4"/>
+              <w:left w:val="single" w:color="C7D0DD" w:sz="4"/>
+              <w:bottom w:val="single" w:color="C7D0DD" w:sz="4"/>
+              <w:right w:val="single" w:color="C7D0DD" w:sz="4"/>
+            </w:tcBorders>
+            <w:shd w:fill="FFFFFF" w:val="clear"/>
+            <w:tcMar>
+              <w:top w:type="dxa" w:w="50"/>
+              <w:left w:type="dxa" w:w="90"/>
+              <w:bottom w:type="dxa" w:w="50"/>
+              <w:right w:type="dxa" w:w="90"/>
+            </w:tcMar>
+          </w:tcPr>
+          <w:p>
+            <w:pPr>
+              <w:bidi/>
+              <w:jc w:val="center"/>
+            </w:pPr>
+            <w:r>
+              <w:rPr>
+                <w:rFonts w:ascii="David" w:cs="David" w:eastAsia="David" w:hAnsi="David"/>
+                <w:color w:val="1A1A2E"/>
+                <w:sz w:val="18"/>
+                <w:szCs w:val="18"/>
+                <w:rtl/>
+              </w:rPr>
+              <w:t xml:space="preserve">‎9,350‎</w:t>
+            </w:r>
+          </w:p>
+        </w:tc>
+        <w:tc>
+          <w:tcPr>
+            <w:tcW w:type="dxa" w:w="1800"/>
+            <w:tcBorders>
+              <w:top w:val="single" w:color="C7D0DD" w:sz="4"/>
+              <w:left w:val="single" w:color="C7D0DD" w:sz="4"/>
+              <w:bottom w:val="single" w:color="C7D0DD" w:sz="4"/>
+              <w:right w:val="single" w:color="C7D0DD" w:sz="4"/>
+            </w:tcBorders>
+            <w:shd w:fill="FFFFFF" w:val="clear"/>
+            <w:tcMar>
+              <w:top w:type="dxa" w:w="50"/>
+              <w:left w:type="dxa" w:w="90"/>
+              <w:bottom w:type="dxa" w:w="50"/>
+              <w:right w:type="dxa" w:w="90"/>
+            </w:tcMar>
+          </w:tcPr>
+          <w:p>
+            <w:pPr>
+              <w:bidi/>
+              <w:jc w:val="center"/>
+            </w:pPr>
+            <w:r>
+              <w:rPr>
+                <w:rFonts w:ascii="David" w:cs="David" w:eastAsia="David" w:hAnsi="David"/>
+                <w:color w:val="1A1A2E"/>
+                <w:sz w:val="18"/>
+                <w:szCs w:val="18"/>
+                <w:rtl/>
+              </w:rPr>
+              <w:t xml:space="preserve">‎9,937‎</w:t>
+            </w:r>
+          </w:p>
+        </w:tc>
+      </w:tr>
+      <w:tr>
+        <w:tc>
+          <w:tcPr>
+            <w:tcW w:type="dxa" w:w="2400"/>
+            <w:tcBorders>
+              <w:top w:val="single" w:color="C7D0DD" w:sz="4"/>
+              <w:left w:val="single" w:color="C7D0DD" w:sz="4"/>
+              <w:bottom w:val="single" w:color="C7D0DD" w:sz="4"/>
+              <w:right w:val="single" w:color="C7D0DD" w:sz="4"/>
+            </w:tcBorders>
+            <w:shd w:fill="FFFFFF" w:val="clear"/>
+            <w:tcMar>
+              <w:top w:type="dxa" w:w="50"/>
+              <w:left w:type="dxa" w:w="90"/>
+              <w:bottom w:type="dxa" w:w="50"/>
+              <w:right w:type="dxa" w:w="90"/>
+            </w:tcMar>
+          </w:tcPr>
+          <w:p>
+            <w:pPr>
+              <w:bidi/>
+              <w:jc w:val="center"/>
+            </w:pPr>
+            <w:r>
+              <w:rPr>
+                <w:rFonts w:ascii="David" w:cs="David" w:eastAsia="David" w:hAnsi="David"/>
+                <w:color w:val="1A1A2E"/>
+                <w:sz w:val="18"/>
+                <w:szCs w:val="18"/>
+                <w:rtl/>
+              </w:rPr>
+              <w:t xml:space="preserve">קידום נשים</w:t>
+            </w:r>
+          </w:p>
+        </w:tc>
+        <w:tc>
+          <w:tcPr>
+            <w:tcW w:type="dxa" w:w="1800"/>
+            <w:tcBorders>
+              <w:top w:val="single" w:color="C7D0DD" w:sz="4"/>
+              <w:left w:val="single" w:color="C7D0DD" w:sz="4"/>
+              <w:bottom w:val="single" w:color="C7D0DD" w:sz="4"/>
+              <w:right w:val="single" w:color="C7D0DD" w:sz="4"/>
+            </w:tcBorders>
+            <w:shd w:fill="FFFFFF" w:val="clear"/>
+            <w:tcMar>
+              <w:top w:type="dxa" w:w="50"/>
+              <w:left w:type="dxa" w:w="90"/>
+              <w:bottom w:type="dxa" w:w="50"/>
+              <w:right w:type="dxa" w:w="90"/>
+            </w:tcMar>
+          </w:tcPr>
+          <w:p>
+            <w:pPr>
+              <w:bidi/>
+              <w:jc w:val="center"/>
+            </w:pPr>
+            <w:r>
+              <w:rPr>
+                <w:rFonts w:ascii="David" w:cs="David" w:eastAsia="David" w:hAnsi="David"/>
+                <w:color w:val="1A1A2E"/>
+                <w:sz w:val="18"/>
+                <w:szCs w:val="18"/>
+                <w:rtl/>
+              </w:rPr>
+              <w:t xml:space="preserve">‎1,213‎</w:t>
+            </w:r>
+          </w:p>
+        </w:tc>
+        <w:tc>
+          <w:tcPr>
+            <w:tcW w:type="dxa" w:w="1800"/>
+            <w:tcBorders>
+              <w:top w:val="single" w:color="C7D0DD" w:sz="4"/>
+              <w:left w:val="single" w:color="C7D0DD" w:sz="4"/>
+              <w:bottom w:val="single" w:color="C7D0DD" w:sz="4"/>
+              <w:right w:val="single" w:color="C7D0DD" w:sz="4"/>
+            </w:tcBorders>
+            <w:shd w:fill="FFFFFF" w:val="clear"/>
+            <w:tcMar>
+              <w:top w:type="dxa" w:w="50"/>
+              <w:left w:type="dxa" w:w="90"/>
+              <w:bottom w:type="dxa" w:w="50"/>
+              <w:right w:type="dxa" w:w="90"/>
+            </w:tcMar>
+          </w:tcPr>
+          <w:p>
+            <w:pPr>
+              <w:bidi/>
+              <w:jc w:val="center"/>
+            </w:pPr>
+            <w:r>
+              <w:rPr>
+                <w:rFonts w:ascii="David" w:cs="David" w:eastAsia="David" w:hAnsi="David"/>
+                <w:color w:val="1A1A2E"/>
+                <w:sz w:val="18"/>
+                <w:szCs w:val="18"/>
+                <w:rtl/>
+              </w:rPr>
+              <w:t xml:space="preserve">‎1,035‎</w:t>
+            </w:r>
+          </w:p>
+        </w:tc>
+        <w:tc>
+          <w:tcPr>
+            <w:tcW w:type="dxa" w:w="1800"/>
+            <w:tcBorders>
+              <w:top w:val="single" w:color="C7D0DD" w:sz="4"/>
+              <w:left w:val="single" w:color="C7D0DD" w:sz="4"/>
+              <w:bottom w:val="single" w:color="C7D0DD" w:sz="4"/>
+              <w:right w:val="single" w:color="C7D0DD" w:sz="4"/>
+            </w:tcBorders>
+            <w:shd w:fill="FFFFFF" w:val="clear"/>
+            <w:tcMar>
+              <w:top w:type="dxa" w:w="50"/>
+              <w:left w:type="dxa" w:w="90"/>
+              <w:bottom w:type="dxa" w:w="50"/>
+              <w:right w:type="dxa" w:w="90"/>
+            </w:tcMar>
+          </w:tcPr>
+          <w:p>
+            <w:pPr>
+              <w:bidi/>
+              <w:jc w:val="center"/>
+            </w:pPr>
+            <w:r>
+              <w:rPr>
+                <w:rFonts w:ascii="David" w:cs="David" w:eastAsia="David" w:hAnsi="David"/>
+                <w:color w:val="1A1A2E"/>
+                <w:sz w:val="18"/>
+                <w:szCs w:val="18"/>
+                <w:rtl/>
+              </w:rPr>
+              <w:t xml:space="preserve">‎541‎</w:t>
+            </w:r>
+          </w:p>
+        </w:tc>
+      </w:tr>
+      <w:tr>
+        <w:tc>
+          <w:tcPr>
+            <w:tcW w:type="dxa" w:w="2400"/>
+            <w:tcBorders>
+              <w:top w:val="single" w:color="C7D0DD" w:sz="4"/>
+              <w:left w:val="single" w:color="C7D0DD" w:sz="4"/>
+              <w:bottom w:val="single" w:color="C7D0DD" w:sz="4"/>
+              <w:right w:val="single" w:color="C7D0DD" w:sz="4"/>
+            </w:tcBorders>
+            <w:shd w:fill="FFFFFF" w:val="clear"/>
+            <w:tcMar>
+              <w:top w:type="dxa" w:w="50"/>
+              <w:left w:type="dxa" w:w="90"/>
+              <w:bottom w:type="dxa" w:w="50"/>
+              <w:right w:type="dxa" w:w="90"/>
+            </w:tcMar>
+          </w:tcPr>
+          <w:p>
+            <w:pPr>
+              <w:bidi/>
+              <w:jc w:val="center"/>
+            </w:pPr>
+            <w:r>
+              <w:rPr>
+                <w:rFonts w:ascii="David" w:cs="David" w:eastAsia="David" w:hAnsi="David"/>
+                <w:color w:val="1A1A2E"/>
+                <w:sz w:val="18"/>
+                <w:szCs w:val="18"/>
+                <w:rtl/>
+              </w:rPr>
+              <w:t xml:space="preserve">מרכזי מצוינות</w:t>
+            </w:r>
+          </w:p>
+        </w:tc>
+        <w:tc>
+          <w:tcPr>
+            <w:tcW w:type="dxa" w:w="1800"/>
+            <w:tcBorders>
+              <w:top w:val="single" w:color="C7D0DD" w:sz="4"/>
+              <w:left w:val="single" w:color="C7D0DD" w:sz="4"/>
+              <w:bottom w:val="single" w:color="C7D0DD" w:sz="4"/>
+              <w:right w:val="single" w:color="C7D0DD" w:sz="4"/>
+            </w:tcBorders>
+            <w:shd w:fill="FFFFFF" w:val="clear"/>
+            <w:tcMar>
+              <w:top w:type="dxa" w:w="50"/>
+              <w:left w:type="dxa" w:w="90"/>
+              <w:bottom w:type="dxa" w:w="50"/>
+              <w:right w:type="dxa" w:w="90"/>
+            </w:tcMar>
+          </w:tcPr>
+          <w:p>
+            <w:pPr>
+              <w:bidi/>
+              <w:jc w:val="center"/>
+            </w:pPr>
+            <w:r>
+              <w:rPr>
+                <w:rFonts w:ascii="David" w:cs="David" w:eastAsia="David" w:hAnsi="David"/>
+                <w:color w:val="1A1A2E"/>
+                <w:sz w:val="18"/>
+                <w:szCs w:val="18"/>
+                <w:rtl/>
+              </w:rPr>
+              <w:t xml:space="preserve">‎18.2‎</w:t>
+            </w:r>
+          </w:p>
+        </w:tc>
+        <w:tc>
+          <w:tcPr>
+            <w:tcW w:type="dxa" w:w="1800"/>
+            <w:tcBorders>
+              <w:top w:val="single" w:color="C7D0DD" w:sz="4"/>
+              <w:left w:val="single" w:color="C7D0DD" w:sz="4"/>
+              <w:bottom w:val="single" w:color="C7D0DD" w:sz="4"/>
+              <w:right w:val="single" w:color="C7D0DD" w:sz="4"/>
+            </w:tcBorders>
+            <w:shd w:fill="FFFFFF" w:val="clear"/>
+            <w:tcMar>
+              <w:top w:type="dxa" w:w="50"/>
+              <w:left w:type="dxa" w:w="90"/>
+              <w:bottom w:type="dxa" w:w="50"/>
+              <w:right w:type="dxa" w:w="90"/>
+            </w:tcMar>
+          </w:tcPr>
+          <w:p>
+            <w:pPr>
+              <w:bidi/>
+              <w:jc w:val="center"/>
+            </w:pPr>
+            <w:r>
+              <w:rPr>
+                <w:rFonts w:ascii="David" w:cs="David" w:eastAsia="David" w:hAnsi="David"/>
+                <w:color w:val="1A1A2E"/>
+                <w:sz w:val="18"/>
+                <w:szCs w:val="18"/>
+                <w:rtl/>
+              </w:rPr>
+              <w:t xml:space="preserve">—</w:t>
+            </w:r>
+          </w:p>
+        </w:tc>
+        <w:tc>
+          <w:tcPr>
+            <w:tcW w:type="dxa" w:w="1800"/>
+            <w:tcBorders>
+              <w:top w:val="single" w:color="C7D0DD" w:sz="4"/>
+              <w:left w:val="single" w:color="C7D0DD" w:sz="4"/>
+              <w:bottom w:val="single" w:color="C7D0DD" w:sz="4"/>
+              <w:right w:val="single" w:color="C7D0DD" w:sz="4"/>
+            </w:tcBorders>
+            <w:shd w:fill="FFFFFF" w:val="clear"/>
+            <w:tcMar>
+              <w:top w:type="dxa" w:w="50"/>
+              <w:left w:type="dxa" w:w="90"/>
+              <w:bottom w:type="dxa" w:w="50"/>
+              <w:right w:type="dxa" w:w="90"/>
+            </w:tcMar>
+          </w:tcPr>
+          <w:p>
+            <w:pPr>
+              <w:bidi/>
+              <w:jc w:val="center"/>
+            </w:pPr>
+            <w:r>
+              <w:rPr>
+                <w:rFonts w:ascii="David" w:cs="David" w:eastAsia="David" w:hAnsi="David"/>
+                <w:color w:val="1A1A2E"/>
+                <w:sz w:val="18"/>
+                <w:szCs w:val="18"/>
+                <w:rtl/>
+              </w:rPr>
+              <w:t xml:space="preserve">—</w:t>
+            </w:r>
+          </w:p>
+        </w:tc>
+      </w:tr>
+    </w:tbl>
+    <w:p>
+      <w:pPr>
+        <w:bidi/>
+      </w:pPr>
+    </w:p>
+    <w:p>
+      <w:pPr>
+        <w:bidi/>
+        <w:spacing w:after="120" w:before="60"/>
+        <w:jc w:val="start"/>
+      </w:pPr>
+      <w:r>
+        <w:rPr>
+          <w:rFonts w:ascii="David" w:cs="David" w:eastAsia="David" w:hAnsi="David"/>
+          <w:sz w:val="22"/>
+          <w:szCs w:val="22"/>
+          <w:rtl/>
+        </w:rPr>
+        <w:t xml:space="preserve">הערכים מדויקים (קופה × משקל ÷ סך-ניקוד) וניתנים להעברה ישירה ל-QuickSight כמדד </w:t>
+      </w:r>
+      <w:r>
+        <w:rPr>
+          <w:rFonts w:ascii="David" w:cs="David" w:eastAsia="David" w:hAnsi="David"/>
+          <w:b/>
+          <w:bCs/>
+          <w:sz w:val="22"/>
+          <w:szCs w:val="22"/>
+          <w:rtl/>
+        </w:rPr>
+        <w:t xml:space="preserve">"ש״ח לנקודה" לכל סוג נקודה.</w:t>
+      </w:r>
+    </w:p>
+    <w:p>
+      <w:pPr>
+        <w:pStyle w:val="Heading1"/>
+        <w:bidi/>
+        <w:spacing w:after="130" w:before="300"/>
+        <w:jc w:val="start"/>
+      </w:pPr>
+      <w:r>
+        <w:rPr>
+          <w:rFonts w:ascii="David" w:cs="David" w:eastAsia="David" w:hAnsi="David"/>
+          <w:b/>
+          <w:bCs/>
+          <w:color w:val="1F3F6D"/>
+          <w:sz w:val="25"/>
+          <w:szCs w:val="25"/>
+          <w:rtl/>
+        </w:rPr>
+        <w:t xml:space="preserve">QuickSight — שדה לכל אמת מידה</w:t>
+      </w:r>
+    </w:p>
+    <w:p>
+      <w:pPr>
+        <w:bidi/>
+        <w:spacing w:after="120" w:before="60"/>
+        <w:jc w:val="start"/>
+      </w:pPr>
+      <w:r>
+        <w:rPr>
+          <w:rFonts w:ascii="David" w:cs="David" w:eastAsia="David" w:hAnsi="David"/>
+          <w:sz w:val="22"/>
+          <w:szCs w:val="22"/>
+          <w:rtl/>
+        </w:rPr>
+        <w:t xml:space="preserve">לכל אמת מידה c, עם המשקל הקבוע </w:t>
+      </w:r>
+      <w:r>
+        <w:rPr>
+          <w:rFonts w:ascii="David" w:cs="David" w:eastAsia="David" w:hAnsi="David"/>
+          <w:b/>
+          <w:bCs/>
+          <w:sz w:val="22"/>
+          <w:szCs w:val="22"/>
+          <w:rtl/>
+        </w:rPr>
+        <w:t xml:space="preserve">w_c</w:t>
+      </w:r>
+      <w:r>
+        <w:rPr>
+          <w:rFonts w:ascii="David" w:cs="David" w:eastAsia="David" w:hAnsi="David"/>
+          <w:sz w:val="22"/>
+          <w:szCs w:val="22"/>
+          <w:rtl/>
+        </w:rPr>
+        <w:t xml:space="preserve"> מהמבחן:</w:t>
+      </w:r>
+    </w:p>
+    <w:p>
+      <w:pPr>
+        <w:bidi/>
+        <w:spacing w:after="120" w:before="60"/>
+        <w:jc w:val="start"/>
+      </w:pPr>
+      <w:r>
+        <w:rPr>
+          <w:rFonts w:ascii="David" w:cs="David" w:eastAsia="David" w:hAnsi="David"/>
+          <w:b/>
+          <w:bCs/>
+          <w:color w:val="1F3F6D"/>
+          <w:sz w:val="22"/>
+          <w:szCs w:val="22"/>
+          <w:rtl/>
+        </w:rPr>
+        <w:t xml:space="preserve">R_c = (sumOver({approved_amount},[{category}]) * {w_c}) / sumOver({points_c},[{category}])</w:t>
+      </w:r>
+    </w:p>
+    <w:p>
+      <w:pPr>
+        <w:bidi/>
+        <w:spacing w:after="120" w:before="60"/>
+        <w:jc w:val="start"/>
+      </w:pPr>
+      <w:r>
+        <w:rPr>
+          <w:rFonts w:ascii="David" w:cs="David" w:eastAsia="David" w:hAnsi="David"/>
+          <w:b/>
+          <w:bCs/>
+          <w:color w:val="1F3F6D"/>
+          <w:sz w:val="22"/>
+          <w:szCs w:val="22"/>
+          <w:rtl/>
+        </w:rPr>
+        <w:t xml:space="preserve">allocation_c = {points_c} * R_c</w:t>
+      </w:r>
+    </w:p>
+    <w:p>
+      <w:pPr>
+        <w:bidi/>
+        <w:spacing w:after="120" w:before="60"/>
+        <w:jc w:val="start"/>
+      </w:pPr>
+      <w:r>
+        <w:rPr>
+          <w:rFonts w:ascii="David" w:cs="David" w:eastAsia="David" w:hAnsi="David"/>
+          <w:sz w:val="22"/>
+          <w:szCs w:val="22"/>
+          <w:rtl/>
+        </w:rPr>
+        <w:t xml:space="preserve">סכום ה-allocation על כל אמות המידה משחזר את approved_amount, עד שכבת אירופה (משולמת בנפרד) ותקרת ההגנה (סכום-אפס).</w:t>
+      </w:r>
+    </w:p>
+    <w:p>
+      <w:pPr>
+        <w:bidi/>
+        <w:spacing w:after="120" w:before="60"/>
+        <w:jc w:val="start"/>
+      </w:pPr>
+      <w:r>
+        <w:rPr>
+          <w:rFonts w:ascii="David" w:cs="David" w:eastAsia="David" w:hAnsi="David"/>
+          <w:b/>
+          <w:bCs/>
+          <w:color w:val="248A3D"/>
+          <w:sz w:val="22"/>
+          <w:szCs w:val="22"/>
+          <w:rtl/>
+        </w:rPr>
+        <w:t xml:space="preserve">מסקנה: </w:t>
+      </w:r>
+      <w:r>
+        <w:rPr>
+          <w:rFonts w:ascii="David" w:cs="David" w:eastAsia="David" w:hAnsi="David"/>
+          <w:sz w:val="22"/>
+          <w:szCs w:val="22"/>
+          <w:rtl/>
+        </w:rPr>
+        <w:t xml:space="preserve">אין שארית לא-מוסברת. חד-קריטריוני (שוטף) מדויק לאגורה; רב-קריטריוני R²=0.998 עם שארית = אירופה (שכבה ידועה ונפרדת) + תקרה (סכום-אפס). הנוסחאות מוכנות להעברה ל-QuickSight ליצירת מדדי תקצוב ש״ח-לנקודה לכל סוג נקודה.</w:t>
       </w:r>
     </w:p>
     <w:p>

</xml_diff>